<commit_message>
Stage 3 currency set up
</commit_message>
<xml_diff>
--- a/The Cards Collective.docx
+++ b/The Cards Collective.docx
@@ -4406,13 +4406,8 @@
         <w:t xml:space="preserve"> I </w:t>
       </w:r>
       <w:r>
-        <w:t xml:space="preserve">never played poker or blackjack until I was </w:t>
-      </w:r>
-      <w:proofErr w:type="gramStart"/>
-      <w:r>
-        <w:t>older</w:t>
-      </w:r>
-      <w:proofErr w:type="gramEnd"/>
+        <w:t>never played poker or blackjack until I was older</w:t>
+      </w:r>
       <w:r>
         <w:t xml:space="preserve"> but I found </w:t>
       </w:r>
@@ -4752,16 +4747,11 @@
       <w:r>
         <w:t xml:space="preserve">PlayStation, Xbox and </w:t>
       </w:r>
-      <w:proofErr w:type="gramStart"/>
       <w:r>
         <w:t>Windows</w:t>
       </w:r>
       <w:r>
-        <w:t>(</w:t>
-      </w:r>
-      <w:proofErr w:type="gramEnd"/>
-      <w:r>
-        <w:t>Steam)</w:t>
+        <w:t>(Steam)</w:t>
       </w:r>
     </w:p>
     <w:p>
@@ -4800,13 +4790,8 @@
         <w:t xml:space="preserve">: </w:t>
       </w:r>
       <w:r>
-        <w:t xml:space="preserve">Poker      </w:t>
-      </w:r>
-      <w:proofErr w:type="gramStart"/>
-      <w:r>
-        <w:t xml:space="preserve">   (</w:t>
-      </w:r>
-      <w:proofErr w:type="gramEnd"/>
+        <w:t>Poker         (</w:t>
+      </w:r>
       <w:r>
         <w:t>N</w:t>
       </w:r>
@@ -4855,15 +4840,7 @@
         <w:t xml:space="preserve"> </w:t>
       </w:r>
       <w:r>
-        <w:t xml:space="preserve">Online and single player       </w:t>
-      </w:r>
-      <w:proofErr w:type="gramStart"/>
-      <w:r>
-        <w:t xml:space="preserve">   (</w:t>
-      </w:r>
-      <w:proofErr w:type="gramEnd"/>
-      <w:r>
-        <w:t>No local multiplayer)</w:t>
+        <w:t>Online and single player          (No local multiplayer)</w:t>
       </w:r>
     </w:p>
     <w:p>
@@ -4874,7 +4851,6 @@
           <w:numId w:val="4"/>
         </w:numPr>
       </w:pPr>
-      <w:proofErr w:type="gramStart"/>
       <w:r>
         <w:rPr>
           <w:b/>
@@ -4882,7 +4858,6 @@
         </w:rPr>
         <w:t>View point</w:t>
       </w:r>
-      <w:proofErr w:type="gramEnd"/>
       <w:r>
         <w:t xml:space="preserve">: </w:t>
       </w:r>
@@ -5024,15 +4999,7 @@
           </w:tcPr>
           <w:p>
             <w:r>
-              <w:t xml:space="preserve">I would like to integrate the feature that the amount of currency a player has is displayed in number </w:t>
-            </w:r>
-            <w:proofErr w:type="gramStart"/>
-            <w:r>
-              <w:t>and also</w:t>
-            </w:r>
-            <w:proofErr w:type="gramEnd"/>
-            <w:r>
-              <w:t xml:space="preserve"> size on the table </w:t>
+              <w:t xml:space="preserve">I would like to integrate the feature that the amount of currency a player has is displayed in number and also size on the table </w:t>
             </w:r>
             <w:proofErr w:type="spellStart"/>
             <w:r>
@@ -5053,12 +5020,10 @@
               <w:t xml:space="preserve">I </w:t>
             </w:r>
             <w:proofErr w:type="spellStart"/>
-            <w:proofErr w:type="gramStart"/>
             <w:r>
               <w:t>wont</w:t>
             </w:r>
             <w:proofErr w:type="spellEnd"/>
-            <w:proofErr w:type="gramEnd"/>
             <w:r>
               <w:t xml:space="preserve"> be integrating online play as there are already loads of games like this that use it and it will bring too much competition while my game is supposed to be relax</w:t>
             </w:r>
@@ -5066,15 +5031,7 @@
               <w:t>ed</w:t>
             </w:r>
             <w:r>
-              <w:t xml:space="preserve">. </w:t>
-            </w:r>
-            <w:proofErr w:type="gramStart"/>
-            <w:r>
-              <w:t>Instead</w:t>
-            </w:r>
-            <w:proofErr w:type="gramEnd"/>
-            <w:r>
-              <w:t xml:space="preserve"> I will be having local multiplayer and a singleplayer</w:t>
+              <w:t>. Instead I will be having local multiplayer and a singleplayer</w:t>
             </w:r>
           </w:p>
         </w:tc>
@@ -5141,15 +5098,7 @@
           </w:tcPr>
           <w:p>
             <w:r>
-              <w:t xml:space="preserve">Player customization is unnecessary as my game will be a </w:t>
-            </w:r>
-            <w:proofErr w:type="gramStart"/>
-            <w:r>
-              <w:t>first person</w:t>
-            </w:r>
-            <w:proofErr w:type="gramEnd"/>
-            <w:r>
-              <w:t xml:space="preserve"> view of the table so no players will be seen such as clothing hats tattoos piercings etc</w:t>
+              <w:t>Player customization is unnecessary as my game will be a first person view of the table so no players will be seen such as clothing hats tattoos piercings etc</w:t>
             </w:r>
           </w:p>
         </w:tc>
@@ -5293,7 +5242,6 @@
       <w:r>
         <w:t xml:space="preserve"> </w:t>
       </w:r>
-      <w:proofErr w:type="gramStart"/>
       <w:r>
         <w:rPr>
           <w:sz w:val="14"/>
@@ -5306,15 +5254,21 @@
           <w:sz w:val="14"/>
           <w:szCs w:val="14"/>
         </w:rPr>
-        <w:t>(</w:t>
-      </w:r>
-      <w:proofErr w:type="gramEnd"/>
+        <w:t>(Steam),</w:t>
+      </w:r>
       <w:r>
         <w:rPr>
           <w:sz w:val="14"/>
           <w:szCs w:val="14"/>
         </w:rPr>
-        <w:t>Steam),</w:t>
+        <w:t xml:space="preserve"> MacOS(Steam)</w:t>
+      </w:r>
+      <w:r>
+        <w:rPr>
+          <w:sz w:val="14"/>
+          <w:szCs w:val="14"/>
+        </w:rPr>
+        <w:t>, Android (Google play)</w:t>
       </w:r>
       <w:r>
         <w:rPr>
@@ -5323,28 +5277,19 @@
         </w:rPr>
         <w:t xml:space="preserve"> </w:t>
       </w:r>
-      <w:proofErr w:type="gramStart"/>
       <w:r>
         <w:rPr>
           <w:sz w:val="14"/>
           <w:szCs w:val="14"/>
         </w:rPr>
-        <w:t>MacOS(</w:t>
-      </w:r>
-      <w:proofErr w:type="gramEnd"/>
+        <w:t>iOS</w:t>
+      </w:r>
       <w:r>
         <w:rPr>
           <w:sz w:val="14"/>
           <w:szCs w:val="14"/>
         </w:rPr>
-        <w:t>Steam)</w:t>
-      </w:r>
-      <w:r>
-        <w:rPr>
-          <w:sz w:val="14"/>
-          <w:szCs w:val="14"/>
-        </w:rPr>
-        <w:t>, Android (Google play)</w:t>
+        <w:t>(App store),</w:t>
       </w:r>
       <w:r>
         <w:rPr>
@@ -5353,58 +5298,12 @@
         </w:rPr>
         <w:t xml:space="preserve"> </w:t>
       </w:r>
-      <w:proofErr w:type="gramStart"/>
       <w:r>
         <w:rPr>
           <w:sz w:val="14"/>
           <w:szCs w:val="14"/>
         </w:rPr>
-        <w:t>iOS</w:t>
-      </w:r>
-      <w:r>
-        <w:rPr>
-          <w:sz w:val="14"/>
-          <w:szCs w:val="14"/>
-        </w:rPr>
-        <w:t>(</w:t>
-      </w:r>
-      <w:proofErr w:type="gramEnd"/>
-      <w:r>
-        <w:rPr>
-          <w:sz w:val="14"/>
-          <w:szCs w:val="14"/>
-        </w:rPr>
-        <w:t>App store),</w:t>
-      </w:r>
-      <w:r>
-        <w:rPr>
-          <w:sz w:val="14"/>
-          <w:szCs w:val="14"/>
-        </w:rPr>
-        <w:t xml:space="preserve"> </w:t>
-      </w:r>
-      <w:r>
-        <w:rPr>
-          <w:sz w:val="14"/>
-          <w:szCs w:val="14"/>
-        </w:rPr>
-        <w:t xml:space="preserve">Apple </w:t>
-      </w:r>
-      <w:proofErr w:type="gramStart"/>
-      <w:r>
-        <w:rPr>
-          <w:sz w:val="14"/>
-          <w:szCs w:val="14"/>
-        </w:rPr>
-        <w:t>TV(</w:t>
-      </w:r>
-      <w:proofErr w:type="gramEnd"/>
-      <w:r>
-        <w:rPr>
-          <w:sz w:val="14"/>
-          <w:szCs w:val="14"/>
-        </w:rPr>
-        <w:t>App store)</w:t>
+        <w:t>Apple TV(App store)</w:t>
       </w:r>
       <w:r>
         <w:rPr>
@@ -5460,15 +5359,7 @@
         <w:t>:</w:t>
       </w:r>
       <w:r>
-        <w:t xml:space="preserve"> Blackjack</w:t>
-      </w:r>
-      <w:proofErr w:type="gramStart"/>
-      <w:r>
-        <w:t xml:space="preserve">   (</w:t>
-      </w:r>
-      <w:proofErr w:type="gramEnd"/>
-      <w:r>
-        <w:t>No poker)</w:t>
+        <w:t xml:space="preserve"> Blackjack   (No poker)</w:t>
       </w:r>
     </w:p>
     <w:p>
@@ -5515,15 +5406,7 @@
         <w:t>Multiplayer</w:t>
       </w:r>
       <w:r>
-        <w:t xml:space="preserve">       </w:t>
-      </w:r>
-      <w:proofErr w:type="gramStart"/>
-      <w:r>
-        <w:t xml:space="preserve">   (</w:t>
-      </w:r>
-      <w:proofErr w:type="gramEnd"/>
-      <w:r>
-        <w:t>No local multiplayer</w:t>
+        <w:t xml:space="preserve">          (No local multiplayer</w:t>
       </w:r>
       <w:r>
         <w:t xml:space="preserve"> or Singleplayer</w:t>
@@ -5540,7 +5423,6 @@
           <w:numId w:val="3"/>
         </w:numPr>
       </w:pPr>
-      <w:proofErr w:type="gramStart"/>
       <w:r>
         <w:rPr>
           <w:b/>
@@ -5548,7 +5430,6 @@
         </w:rPr>
         <w:t>View point</w:t>
       </w:r>
-      <w:proofErr w:type="gramEnd"/>
       <w:r>
         <w:t>: 1st person</w:t>
       </w:r>
@@ -5621,15 +5502,7 @@
           </w:tcPr>
           <w:p>
             <w:r>
-              <w:t xml:space="preserve">I like the layout of the </w:t>
-            </w:r>
-            <w:proofErr w:type="gramStart"/>
-            <w:r>
-              <w:t>table</w:t>
-            </w:r>
-            <w:proofErr w:type="gramEnd"/>
-            <w:r>
-              <w:t xml:space="preserve"> but I will have the cards look more like they are placed on the table than floating above it.</w:t>
+              <w:t>I like the layout of the table but I will have the cards look more like they are placed on the table than floating above it.</w:t>
             </w:r>
           </w:p>
           <w:p>
@@ -5661,12 +5534,10 @@
               <w:t xml:space="preserve">I </w:t>
             </w:r>
             <w:proofErr w:type="spellStart"/>
-            <w:proofErr w:type="gramStart"/>
             <w:r>
               <w:t>wont</w:t>
             </w:r>
             <w:proofErr w:type="spellEnd"/>
-            <w:proofErr w:type="gramEnd"/>
             <w:r>
               <w:t xml:space="preserve"> be adding profile pictures or country flags in my game as it is unnecessary when other players are next to </w:t>
             </w:r>
@@ -5730,22 +5601,12 @@
               <w:t xml:space="preserve">I </w:t>
             </w:r>
             <w:proofErr w:type="spellStart"/>
-            <w:proofErr w:type="gramStart"/>
             <w:r>
               <w:t>wont</w:t>
             </w:r>
             <w:proofErr w:type="spellEnd"/>
-            <w:proofErr w:type="gramEnd"/>
-            <w:r>
-              <w:t xml:space="preserve"> be integrating the jackpot as that strays from the </w:t>
-            </w:r>
-            <w:proofErr w:type="gramStart"/>
-            <w:r>
-              <w:t>games</w:t>
-            </w:r>
-            <w:proofErr w:type="gramEnd"/>
-            <w:r>
-              <w:t xml:space="preserve"> actual gameplay of blackjack and poker</w:t>
+            <w:r>
+              <w:t xml:space="preserve"> be integrating the jackpot as that strays from the games actual gameplay of blackjack and poker</w:t>
             </w:r>
           </w:p>
         </w:tc>
@@ -5773,12 +5634,10 @@
               <w:t xml:space="preserve">I </w:t>
             </w:r>
             <w:proofErr w:type="spellStart"/>
-            <w:proofErr w:type="gramStart"/>
             <w:r>
               <w:t>wont</w:t>
             </w:r>
             <w:proofErr w:type="spellEnd"/>
-            <w:proofErr w:type="gramEnd"/>
             <w:r>
               <w:t xml:space="preserve"> be adding</w:t>
             </w:r>
@@ -5987,15 +5846,7 @@
         <w:t>Platforms:</w:t>
       </w:r>
       <w:r>
-        <w:t xml:space="preserve"> PlayStation, Xbox and </w:t>
-      </w:r>
-      <w:proofErr w:type="gramStart"/>
-      <w:r>
-        <w:t>Windows(</w:t>
-      </w:r>
-      <w:proofErr w:type="gramEnd"/>
-      <w:r>
-        <w:t>Steam)</w:t>
+        <w:t xml:space="preserve"> PlayStation, Xbox and Windows(Steam)</w:t>
       </w:r>
     </w:p>
     <w:p>
@@ -6023,15 +5874,7 @@
         <w:t>:</w:t>
       </w:r>
       <w:r>
-        <w:t xml:space="preserve">  Poker        </w:t>
-      </w:r>
-      <w:proofErr w:type="gramStart"/>
-      <w:r>
-        <w:t xml:space="preserve">   (</w:t>
-      </w:r>
-      <w:proofErr w:type="gramEnd"/>
-      <w:r>
-        <w:t>No blackjack)</w:t>
+        <w:t xml:space="preserve">  Poker           (No blackjack)</w:t>
       </w:r>
     </w:p>
     <w:p>
@@ -6080,15 +5923,7 @@
         <w:t>Play modes:</w:t>
       </w:r>
       <w:r>
-        <w:t xml:space="preserve"> Online and single player       </w:t>
-      </w:r>
-      <w:proofErr w:type="gramStart"/>
-      <w:r>
-        <w:t xml:space="preserve">   (</w:t>
-      </w:r>
-      <w:proofErr w:type="gramEnd"/>
-      <w:r>
-        <w:t>No local multiplayer)</w:t>
+        <w:t xml:space="preserve"> Online and single player          (No local multiplayer)</w:t>
       </w:r>
     </w:p>
     <w:p>
@@ -6099,7 +5934,6 @@
           <w:numId w:val="1"/>
         </w:numPr>
       </w:pPr>
-      <w:proofErr w:type="gramStart"/>
       <w:r>
         <w:rPr>
           <w:b/>
@@ -6107,7 +5941,6 @@
         </w:rPr>
         <w:t>View point</w:t>
       </w:r>
-      <w:proofErr w:type="gramEnd"/>
       <w:r>
         <w:t>: 3rd person</w:t>
       </w:r>
@@ -6213,15 +6046,7 @@
           </w:tcPr>
           <w:p>
             <w:r>
-              <w:t xml:space="preserve">I would like to integrate and adapt the sneak peek of the cards shown below only for poker not blackjack. This is because in poker other players cannot see your cards so if a player wants to check their cards all other players must look away and then the player can </w:t>
-            </w:r>
-            <w:proofErr w:type="gramStart"/>
-            <w:r>
-              <w:t>take a peek</w:t>
-            </w:r>
-            <w:proofErr w:type="gramEnd"/>
-            <w:r>
-              <w:t xml:space="preserve"> at their card values</w:t>
+              <w:t>I would like to integrate and adapt the sneak peek of the cards shown below only for poker not blackjack. This is because in poker other players cannot see your cards so if a player wants to check their cards all other players must look away and then the player can take a peek at their card values</w:t>
             </w:r>
           </w:p>
         </w:tc>
@@ -6312,7 +6137,6 @@
       <w:r>
         <w:t xml:space="preserve">Poker card </w:t>
       </w:r>
-      <w:proofErr w:type="gramStart"/>
       <w:r>
         <w:t xml:space="preserve">value </w:t>
       </w:r>
@@ -6320,11 +6144,7 @@
         <w:t xml:space="preserve"> hint</w:t>
       </w:r>
       <w:r>
-        <w:t>s</w:t>
-      </w:r>
-      <w:proofErr w:type="gramEnd"/>
-      <w:r>
-        <w:t>” to learn</w:t>
+        <w:t>s” to learn</w:t>
       </w:r>
       <w:r>
         <w:t xml:space="preserve">. This </w:t>
@@ -6333,18 +6153,10 @@
         <w:t xml:space="preserve">aligns with </w:t>
       </w:r>
       <w:r>
-        <w:t xml:space="preserve">survey feedback from </w:t>
-      </w:r>
-      <w:proofErr w:type="gramStart"/>
-      <w:r>
-        <w:t xml:space="preserve">16-18 </w:t>
-      </w:r>
-      <w:r>
-        <w:t>year olds</w:t>
-      </w:r>
-      <w:proofErr w:type="gramEnd"/>
-      <w:r>
-        <w:t xml:space="preserve"> doing computer related college courses </w:t>
+        <w:t xml:space="preserve">survey feedback from 16-18 </w:t>
+      </w:r>
+      <w:r>
+        <w:t xml:space="preserve">year olds doing computer related college courses </w:t>
       </w:r>
       <w:r>
         <w:t xml:space="preserve">who </w:t>
@@ -6542,23 +6354,7 @@
         <w:ind w:left="1440"/>
       </w:pPr>
       <w:r>
-        <w:t xml:space="preserve">I would say this is an essential part of the game as poker and blackjack revolve around the use of a currency to play properly. I am using French fries as currency chips as this was highly requested in my stakeholder </w:t>
-      </w:r>
-      <w:proofErr w:type="gramStart"/>
-      <w:r>
-        <w:t>survey</w:t>
-      </w:r>
-      <w:proofErr w:type="gramEnd"/>
-      <w:r>
-        <w:t xml:space="preserve"> and it is a play on word for actual chips. </w:t>
-      </w:r>
-      <w:proofErr w:type="gramStart"/>
-      <w:r>
-        <w:t>Also</w:t>
-      </w:r>
-      <w:proofErr w:type="gramEnd"/>
-      <w:r>
-        <w:t xml:space="preserve"> this helps my game stray away from the serious gambling aspect of blackjack and poker by using a different currency from chips or real currencies. </w:t>
+        <w:t xml:space="preserve">I would say this is an essential part of the game as poker and blackjack revolve around the use of a currency to play properly. I am using French fries as currency chips as this was highly requested in my stakeholder survey and it is a play on word for actual chips. Also this helps my game stray away from the serious gambling aspect of blackjack and poker by using a different currency from chips or real currencies. </w:t>
       </w:r>
     </w:p>
     <w:p>
@@ -6652,15 +6448,7 @@
         <w:t>This is not an essential part of the game but a unique and useful feature that allows players to use their own deck of cards to play Cards Collective which will keep count of their currency, game history, and can help manage the game for new players compared to playing with the deck of cards without Cards Collective.</w:t>
       </w:r>
       <w:r>
-        <w:t xml:space="preserve"> I haven’t seen this in other </w:t>
-      </w:r>
-      <w:proofErr w:type="gramStart"/>
-      <w:r>
-        <w:t>games</w:t>
-      </w:r>
-      <w:proofErr w:type="gramEnd"/>
-      <w:r>
-        <w:t xml:space="preserve"> </w:t>
+        <w:t xml:space="preserve"> I haven’t seen this in other games </w:t>
       </w:r>
       <w:r>
         <w:t>but I think it’s a good idea if executed correctly</w:t>
@@ -6849,15 +6637,7 @@
         </w:drawing>
       </w:r>
       <w:r>
-        <w:t xml:space="preserve">The rules are going to be an essential feature for maintaining new players as my survey showed </w:t>
-      </w:r>
-      <w:proofErr w:type="gramStart"/>
-      <w:r>
-        <w:t>the majority of</w:t>
-      </w:r>
-      <w:proofErr w:type="gramEnd"/>
-      <w:r>
-        <w:t xml:space="preserve"> my focus group either did not know how to play poker or were somewhat familiar with it (60%).</w:t>
+        <w:t>The rules are going to be an essential feature for maintaining new players as my survey showed the majority of my focus group either did not know how to play poker or were somewhat familiar with it (60%).</w:t>
       </w:r>
     </w:p>
     <w:p>
@@ -6958,15 +6738,7 @@
       </w:r>
       <w:proofErr w:type="spellEnd"/>
       <w:r>
-        <w:t xml:space="preserve"> be able to see what cards you have but you must be able to see and make decisions based upon them. To sneak peek at your cards </w:t>
-      </w:r>
-      <w:proofErr w:type="gramStart"/>
-      <w:r>
-        <w:t>all of</w:t>
-      </w:r>
-      <w:proofErr w:type="gramEnd"/>
-      <w:r>
-        <w:t xml:space="preserve"> the other players participating in poker should look away from the screen so only you can see what cards you have been delt and you hold down the sneak peek button. I am taking inspiration from the game</w:t>
+        <w:t xml:space="preserve"> be able to see what cards you have but you must be able to see and make decisions based upon them. To sneak peek at your cards all of the other players participating in poker should look away from the screen so only you can see what cards you have been delt and you hold down the sneak peek button. I am taking inspiration from the game</w:t>
       </w:r>
       <w:r>
         <w:t xml:space="preserve"> </w:t>
@@ -7013,15 +6785,7 @@
         <w:ind w:left="720"/>
       </w:pPr>
       <w:r>
-        <w:t xml:space="preserve">This is not essential to the gameplay of Cards </w:t>
-      </w:r>
-      <w:proofErr w:type="gramStart"/>
-      <w:r>
-        <w:t>Collective</w:t>
-      </w:r>
-      <w:proofErr w:type="gramEnd"/>
-      <w:r>
-        <w:t xml:space="preserve"> but I would like to add it as I think it is a necessary feature which will keep players coming back to the game as they can continue with their previous currency balance and resume their game.</w:t>
+        <w:t>This is not essential to the gameplay of Cards Collective but I would like to add it as I think it is a necessary feature which will keep players coming back to the game as they can continue with their previous currency balance and resume their game.</w:t>
       </w:r>
     </w:p>
     <w:p>
@@ -7244,12 +7008,10 @@
         <w:t xml:space="preserve">This feature is not essential nor necessary. I </w:t>
       </w:r>
       <w:proofErr w:type="spellStart"/>
-      <w:proofErr w:type="gramStart"/>
       <w:r>
         <w:t>wont</w:t>
       </w:r>
       <w:proofErr w:type="spellEnd"/>
-      <w:proofErr w:type="gramEnd"/>
       <w:r>
         <w:t xml:space="preserve"> be adding this feature as it aims towards a different target audience and will ruin the casual and fun feel to Cards Collective.</w:t>
       </w:r>
@@ -7271,15 +7033,7 @@
         <w:ind w:left="720"/>
       </w:pPr>
       <w:r>
-        <w:t xml:space="preserve">This is not essential and </w:t>
-      </w:r>
-      <w:proofErr w:type="gramStart"/>
-      <w:r>
-        <w:t>unnecessary</w:t>
-      </w:r>
-      <w:proofErr w:type="gramEnd"/>
-      <w:r>
-        <w:t xml:space="preserve"> and it could ruin the simplistic feel of my project however I may add it as different playing card cosmetics and tables allow players to spend their currency on items which some will work towards helping to maintain some players.</w:t>
+        <w:t>This is not essential and unnecessary and it could ruin the simplistic feel of my project however I may add it as different playing card cosmetics and tables allow players to spend their currency on items which some will work towards helping to maintain some players.</w:t>
       </w:r>
     </w:p>
     <w:p/>
@@ -8050,15 +7804,7 @@
               <w:t xml:space="preserve">physical </w:t>
             </w:r>
             <w:r>
-              <w:t xml:space="preserve">cards will be </w:t>
-            </w:r>
-            <w:proofErr w:type="gramStart"/>
-            <w:r>
-              <w:t>inputted</w:t>
-            </w:r>
-            <w:proofErr w:type="gramEnd"/>
-            <w:r>
-              <w:t xml:space="preserve"> </w:t>
+              <w:t xml:space="preserve">cards will be inputted </w:t>
             </w:r>
             <w:r>
               <w:t>and the</w:t>
@@ -8079,29 +7825,13 @@
               <w:t>/losers.</w:t>
             </w:r>
             <w:r>
-              <w:t xml:space="preserve"> </w:t>
-            </w:r>
-            <w:proofErr w:type="gramStart"/>
-            <w:r>
-              <w:t>POKER(</w:t>
-            </w:r>
-            <w:proofErr w:type="gramEnd"/>
-            <w:r>
-              <w:t xml:space="preserve">Community cards will be </w:t>
+              <w:t xml:space="preserve"> POKER(Community cards will be </w:t>
             </w:r>
             <w:r>
               <w:t>generated by the computer and not be inputted from the</w:t>
             </w:r>
             <w:r>
-              <w:t xml:space="preserve"> </w:t>
-            </w:r>
-            <w:proofErr w:type="gramStart"/>
-            <w:r>
-              <w:t>users</w:t>
-            </w:r>
-            <w:proofErr w:type="gramEnd"/>
-            <w:r>
-              <w:t xml:space="preserve"> physical cards</w:t>
+              <w:t xml:space="preserve"> users physical cards</w:t>
             </w:r>
             <w:r>
               <w:t>)</w:t>
@@ -8117,11 +7847,9 @@
             </w:r>
           </w:p>
           <w:p>
-            <w:proofErr w:type="gramStart"/>
             <w:r>
               <w:t>BLACKJACK(</w:t>
             </w:r>
-            <w:proofErr w:type="gramEnd"/>
             <w:r>
               <w:t>Every time a card would be delt to a player</w:t>
             </w:r>
@@ -8794,15 +8522,7 @@
               <w:jc w:val="center"/>
             </w:pPr>
             <w:r>
-              <w:t xml:space="preserve">Player </w:t>
-            </w:r>
-            <w:proofErr w:type="gramStart"/>
-            <w:r>
-              <w:t>turn</w:t>
-            </w:r>
-            <w:proofErr w:type="gramEnd"/>
-            <w:r>
-              <w:t xml:space="preserve"> cycles</w:t>
+              <w:t>Player turn cycles</w:t>
             </w:r>
           </w:p>
         </w:tc>
@@ -9341,15 +9061,7 @@
               <w:t xml:space="preserve">or draw to </w:t>
             </w:r>
             <w:r>
-              <w:t xml:space="preserve">each </w:t>
-            </w:r>
-            <w:proofErr w:type="gramStart"/>
-            <w:r>
-              <w:t>players</w:t>
-            </w:r>
-            <w:proofErr w:type="gramEnd"/>
-            <w:r>
-              <w:t xml:space="preserve"> </w:t>
+              <w:t xml:space="preserve">each players </w:t>
             </w:r>
             <w:r>
               <w:t xml:space="preserve">balance </w:t>
@@ -10515,12 +10227,10 @@
           </w:tcPr>
           <w:p>
             <w:proofErr w:type="spellStart"/>
-            <w:proofErr w:type="gramStart"/>
             <w:r>
               <w:t>Lets</w:t>
             </w:r>
             <w:proofErr w:type="spellEnd"/>
-            <w:proofErr w:type="gramEnd"/>
             <w:r>
               <w:t xml:space="preserve"> the active player temporarily reveal only their cards on screen while other players look away so they know what they have been delt</w:t>
             </w:r>
@@ -10742,15 +10452,7 @@
               <w:jc w:val="center"/>
             </w:pPr>
             <w:r>
-              <w:t xml:space="preserve">Player </w:t>
-            </w:r>
-            <w:proofErr w:type="gramStart"/>
-            <w:r>
-              <w:t>turn</w:t>
-            </w:r>
-            <w:proofErr w:type="gramEnd"/>
-            <w:r>
-              <w:t xml:space="preserve"> cycles</w:t>
+              <w:t>Player turn cycles</w:t>
             </w:r>
           </w:p>
         </w:tc>
@@ -10919,13 +10621,8 @@
               <w:t>Execute player choice (</w:t>
             </w:r>
             <w:proofErr w:type="spellStart"/>
-            <w:proofErr w:type="gramStart"/>
-            <w:r>
-              <w:t>fold,check</w:t>
-            </w:r>
-            <w:proofErr w:type="gramEnd"/>
-            <w:r>
-              <w:t>,raise</w:t>
+            <w:r>
+              <w:t>fold,check,raise</w:t>
             </w:r>
             <w:proofErr w:type="spellEnd"/>
             <w:r>
@@ -11103,15 +10800,7 @@
               <w:t xml:space="preserve"> turn</w:t>
             </w:r>
             <w:r>
-              <w:t xml:space="preserve"> </w:t>
-            </w:r>
-            <w:proofErr w:type="gramStart"/>
-            <w:r>
-              <w:t>as long as</w:t>
-            </w:r>
-            <w:proofErr w:type="gramEnd"/>
-            <w:r>
-              <w:t xml:space="preserve"> the rest of the players check</w:t>
+              <w:t xml:space="preserve"> as long as the rest of the players check</w:t>
             </w:r>
             <w:r>
               <w:t xml:space="preserve"> for that turn cycle</w:t>
@@ -11352,15 +11041,7 @@
           </w:tcPr>
           <w:p>
             <w:r>
-              <w:t xml:space="preserve">All in increases the bets amount to ALL the active players currency, resetting the turn cycle for all players that are not out. Players that are </w:t>
-            </w:r>
-            <w:proofErr w:type="gramStart"/>
-            <w:r>
-              <w:t>all  in</w:t>
-            </w:r>
-            <w:proofErr w:type="gramEnd"/>
-            <w:r>
-              <w:t xml:space="preserve"> for that round are no longer in the turn cycle but are still in the game and entitled to any currency increase if they win.</w:t>
+              <w:t>All in increases the bets amount to ALL the active players currency, resetting the turn cycle for all players that are not out. Players that are all  in for that round are no longer in the turn cycle but are still in the game and entitled to any currency increase if they win.</w:t>
             </w:r>
           </w:p>
         </w:tc>
@@ -11437,15 +11118,7 @@
           </w:tcPr>
           <w:p>
             <w:r>
-              <w:t xml:space="preserve">Captures each </w:t>
-            </w:r>
-            <w:proofErr w:type="gramStart"/>
-            <w:r>
-              <w:t>players</w:t>
-            </w:r>
-            <w:proofErr w:type="gramEnd"/>
-            <w:r>
-              <w:t xml:space="preserve"> mandatory initial bet at the start of a round</w:t>
+              <w:t>Captures each players mandatory initial bet at the start of a round</w:t>
             </w:r>
           </w:p>
         </w:tc>
@@ -11599,15 +11272,7 @@
           </w:tcPr>
           <w:p>
             <w:r>
-              <w:t xml:space="preserve">Displays the </w:t>
-            </w:r>
-            <w:proofErr w:type="gramStart"/>
-            <w:r>
-              <w:t>total  currency</w:t>
-            </w:r>
-            <w:proofErr w:type="gramEnd"/>
-            <w:r>
-              <w:t xml:space="preserve"> on the table to be claimed (total of the rounds bets)</w:t>
+              <w:t>Displays the total  currency on the table to be claimed (total of the rounds bets)</w:t>
             </w:r>
           </w:p>
         </w:tc>
@@ -12489,15 +12154,7 @@
           </w:tcPr>
           <w:p>
             <w:r>
-              <w:t xml:space="preserve">Saves (to an external file) a </w:t>
-            </w:r>
-            <w:proofErr w:type="gramStart"/>
-            <w:r>
-              <w:t>players</w:t>
-            </w:r>
-            <w:proofErr w:type="gramEnd"/>
-            <w:r>
-              <w:t xml:space="preserve"> username and how much currency they have accumulated</w:t>
+              <w:t>Saves (to an external file) a players username and how much currency they have accumulated</w:t>
             </w:r>
           </w:p>
         </w:tc>
@@ -12651,15 +12308,7 @@
           </w:tcPr>
           <w:p>
             <w:r>
-              <w:t xml:space="preserve">Saves (to an external file) a </w:t>
-            </w:r>
-            <w:proofErr w:type="gramStart"/>
-            <w:r>
-              <w:t>players</w:t>
-            </w:r>
-            <w:proofErr w:type="gramEnd"/>
-            <w:r>
-              <w:t xml:space="preserve"> total wins, draws and losses</w:t>
+              <w:t>Saves (to an external file) a players total wins, draws and losses</w:t>
             </w:r>
           </w:p>
         </w:tc>
@@ -12739,12 +12388,10 @@
               <w:t xml:space="preserve">Loads (from an external file) an existing/previous players total </w:t>
             </w:r>
             <w:proofErr w:type="spellStart"/>
-            <w:proofErr w:type="gramStart"/>
             <w:r>
               <w:t>wins,draws</w:t>
             </w:r>
             <w:proofErr w:type="spellEnd"/>
-            <w:proofErr w:type="gramEnd"/>
             <w:r>
               <w:t xml:space="preserve"> and losses</w:t>
             </w:r>
@@ -12907,17 +12554,12 @@
             <w:r>
               <w:t xml:space="preserve"> from user</w:t>
             </w:r>
-            <w:proofErr w:type="gramStart"/>
             <w:r>
               <w:t xml:space="preserve">),  </w:t>
             </w:r>
             <w:r>
               <w:lastRenderedPageBreak/>
-              <w:t>which</w:t>
-            </w:r>
-            <w:proofErr w:type="gramEnd"/>
-            <w:r>
-              <w:t xml:space="preserve"> will be saved (to external file)</w:t>
+              <w:t>which will be saved (to external file)</w:t>
             </w:r>
           </w:p>
         </w:tc>
@@ -13213,12 +12855,10 @@
             <w:pPr>
               <w:jc w:val="center"/>
             </w:pPr>
-            <w:proofErr w:type="gramStart"/>
             <w:r>
               <w:t>Load(</w:t>
             </w:r>
             <w:proofErr w:type="spellStart"/>
-            <w:proofErr w:type="gramEnd"/>
             <w:r>
               <w:t>ing</w:t>
             </w:r>
@@ -13235,15 +12875,7 @@
           </w:tcPr>
           <w:p>
             <w:r>
-              <w:t xml:space="preserve">If data is corrupted or missing program should start cleanly without freezing or </w:t>
-            </w:r>
-            <w:proofErr w:type="gramStart"/>
-            <w:r>
-              <w:t>crashing(</w:t>
-            </w:r>
-            <w:proofErr w:type="gramEnd"/>
-            <w:r>
-              <w:t>If external file is missing a new one will be created)</w:t>
+              <w:t>If data is corrupted or missing program should start cleanly without freezing or crashing(If external file is missing a new one will be created)</w:t>
             </w:r>
           </w:p>
         </w:tc>
@@ -13715,16 +13347,11 @@
       </w:r>
     </w:p>
     <w:p>
-      <w:proofErr w:type="gramStart"/>
       <w:r>
         <w:t xml:space="preserve">The </w:t>
       </w:r>
       <w:r>
-        <w:t>majority of</w:t>
-      </w:r>
-      <w:proofErr w:type="gramEnd"/>
-      <w:r>
-        <w:t xml:space="preserve"> the code is in python and </w:t>
+        <w:t xml:space="preserve">majority of the code is in python and </w:t>
       </w:r>
       <w:proofErr w:type="spellStart"/>
       <w:r>
@@ -13904,17 +13531,12 @@
         <w:t xml:space="preserve">list each time </w:t>
       </w:r>
       <w:proofErr w:type="spellStart"/>
-      <w:proofErr w:type="gramStart"/>
       <w:r>
         <w:t>ShuffleCards</w:t>
       </w:r>
       <w:proofErr w:type="spellEnd"/>
       <w:r>
-        <w:t>(</w:t>
-      </w:r>
-      <w:proofErr w:type="gramEnd"/>
-      <w:r>
-        <w:t>)</w:t>
+        <w:t>()</w:t>
       </w:r>
       <w:r>
         <w:t xml:space="preserve"> is called</w:t>
@@ -13982,17 +13604,12 @@
     </w:p>
     <w:p>
       <w:proofErr w:type="spellStart"/>
-      <w:proofErr w:type="gramStart"/>
       <w:r>
         <w:t>ShuffleCards</w:t>
       </w:r>
       <w:proofErr w:type="spellEnd"/>
       <w:r>
-        <w:t>(</w:t>
-      </w:r>
-      <w:proofErr w:type="gramEnd"/>
-      <w:r>
-        <w:t>)</w:t>
+        <w:t>()</w:t>
       </w:r>
       <w:r>
         <w:t xml:space="preserve"> function</w:t>
@@ -14123,22 +13740,10 @@
           <w:b/>
           <w:bCs/>
         </w:rPr>
-        <w:t xml:space="preserve">Blackjack </w:t>
-      </w:r>
-      <w:proofErr w:type="gramStart"/>
-      <w:r>
-        <w:rPr>
-          <w:b/>
-          <w:bCs/>
-        </w:rPr>
-        <w:t>system</w:t>
-      </w:r>
-      <w:r>
-        <w:t>:</w:t>
-      </w:r>
-      <w:proofErr w:type="gramEnd"/>
-      <w:r>
-        <w:t xml:space="preserve"> </w:t>
+        <w:t>Blackjack system</w:t>
+      </w:r>
+      <w:r>
+        <w:t xml:space="preserve">: </w:t>
       </w:r>
       <w:r>
         <w:t xml:space="preserve">manages order and sequence of </w:t>
@@ -14162,17 +13767,12 @@
         <w:t xml:space="preserve">applies </w:t>
       </w:r>
       <w:r>
-        <w:t xml:space="preserve">game </w:t>
-      </w:r>
-      <w:proofErr w:type="gramStart"/>
-      <w:r>
-        <w:t>rules</w:t>
+        <w:t>game rules</w:t>
       </w:r>
       <w:r>
         <w:t>(</w:t>
       </w:r>
       <w:proofErr w:type="spellStart"/>
-      <w:proofErr w:type="gramEnd"/>
       <w:r>
         <w:t>e.g</w:t>
       </w:r>
@@ -14380,15 +13980,7 @@
           <w:b/>
           <w:bCs/>
         </w:rPr>
-        <w:t xml:space="preserve"> </w:t>
-      </w:r>
-      <w:proofErr w:type="gramStart"/>
-      <w:r>
-        <w:rPr>
-          <w:b/>
-          <w:bCs/>
-        </w:rPr>
-        <w:t>algor</w:t>
+        <w:t xml:space="preserve"> algor</w:t>
       </w:r>
       <w:r>
         <w:rPr>
@@ -14404,7 +13996,6 @@
         </w:rPr>
         <w:t>:</w:t>
       </w:r>
-      <w:proofErr w:type="gramEnd"/>
       <w:r>
         <w:t xml:space="preserve"> allocates cards to </w:t>
       </w:r>
@@ -14714,32 +14305,16 @@
       </w:r>
       <w:proofErr w:type="spellEnd"/>
       <w:r>
+        <w:t xml:space="preserve"> Blackjack()</w:t>
+      </w:r>
+      <w:r>
+        <w:t>.</w:t>
+      </w:r>
+      <w:r>
         <w:t xml:space="preserve"> </w:t>
       </w:r>
-      <w:proofErr w:type="gramStart"/>
-      <w:r>
-        <w:t>Blackjack(</w:t>
-      </w:r>
-      <w:proofErr w:type="gramEnd"/>
-      <w:r>
-        <w:t>)</w:t>
-      </w:r>
-      <w:r>
-        <w:t>.</w:t>
-      </w:r>
-      <w:r>
-        <w:t xml:space="preserve"> </w:t>
-      </w:r>
-      <w:r>
-        <w:t xml:space="preserve">On the next layer of the </w:t>
-      </w:r>
-      <w:proofErr w:type="gramStart"/>
-      <w:r>
-        <w:t>program</w:t>
-      </w:r>
-      <w:proofErr w:type="gramEnd"/>
-      <w:r>
-        <w:t xml:space="preserve"> it shows the nested sub routines that will be used within</w:t>
+      <w:r>
+        <w:t>On the next layer of the program it shows the nested sub routines that will be used within</w:t>
       </w:r>
       <w:r>
         <w:t xml:space="preserve"> the primary ones.</w:t>
@@ -15126,15 +14701,7 @@
         <w:t>table of poker</w:t>
       </w:r>
       <w:r>
-        <w:t xml:space="preserve"> depending on the total amount of currency invested </w:t>
-      </w:r>
-      <w:proofErr w:type="gramStart"/>
-      <w:r>
-        <w:t>in to</w:t>
-      </w:r>
-      <w:proofErr w:type="gramEnd"/>
-      <w:r>
-        <w:t xml:space="preserve"> the round</w:t>
+        <w:t xml:space="preserve"> depending on the total amount of currency invested in to the round</w:t>
       </w:r>
     </w:p>
     <w:p>
@@ -15508,15 +15075,7 @@
         <w:t xml:space="preserve">I </w:t>
       </w:r>
       <w:r>
-        <w:t xml:space="preserve">added an options button in the top </w:t>
-      </w:r>
-      <w:proofErr w:type="gramStart"/>
-      <w:r>
-        <w:t>right</w:t>
-      </w:r>
-      <w:proofErr w:type="gramEnd"/>
-      <w:r>
-        <w:t xml:space="preserve"> and this is where the poker </w:t>
+        <w:t xml:space="preserve">added an options button in the top right and this is where the poker </w:t>
       </w:r>
       <w:r>
         <w:t xml:space="preserve">card rankings can be accessed. I </w:t>
@@ -15525,15 +15084,7 @@
         <w:t xml:space="preserve">ended up moving the cards in the centre upwards to make space for the currency pool </w:t>
       </w:r>
       <w:r>
-        <w:t xml:space="preserve">that will be in the centre which will be the total of every </w:t>
-      </w:r>
-      <w:proofErr w:type="gramStart"/>
-      <w:r>
-        <w:t>players</w:t>
-      </w:r>
-      <w:proofErr w:type="gramEnd"/>
-      <w:r>
-        <w:t xml:space="preserve"> invested currency.</w:t>
+        <w:t>that will be in the centre which will be the total of every players invested currency.</w:t>
       </w:r>
     </w:p>
     <w:p>
@@ -15562,13 +15113,8 @@
       </w:r>
     </w:p>
     <w:p>
-      <w:proofErr w:type="gramStart"/>
-      <w:r>
-        <w:t>Also</w:t>
-      </w:r>
-      <w:proofErr w:type="gramEnd"/>
-      <w:r>
-        <w:t xml:space="preserve"> I mistakenly put 3 community cards (the </w:t>
+      <w:r>
+        <w:t xml:space="preserve">Also I mistakenly put 3 community cards (the </w:t>
       </w:r>
       <w:r>
         <w:t>cards near the top of the screen</w:t>
@@ -15806,18 +15352,10 @@
         <w:t xml:space="preserve">which will return to normal once their turn is over </w:t>
       </w:r>
       <w:r>
-        <w:t xml:space="preserve">and which players are </w:t>
-      </w:r>
-      <w:proofErr w:type="gramStart"/>
-      <w:r>
-        <w:t xml:space="preserve">out </w:t>
-      </w:r>
-      <w:r>
-        <w:t xml:space="preserve"> (</w:t>
-      </w:r>
-      <w:proofErr w:type="gramEnd"/>
-      <w:r>
-        <w:t>Name is strikethrough).</w:t>
+        <w:t xml:space="preserve">and which players are out </w:t>
+      </w:r>
+      <w:r>
+        <w:t xml:space="preserve"> (Name is strikethrough).</w:t>
       </w:r>
     </w:p>
     <w:p>
@@ -15876,15 +15414,7 @@
         <w:t xml:space="preserve">mouse click on shuffler. I decided to make this the button to get another card as it </w:t>
       </w:r>
       <w:r>
-        <w:t xml:space="preserve">adds to the realism of getting a card from the </w:t>
-      </w:r>
-      <w:proofErr w:type="gramStart"/>
-      <w:r>
-        <w:t>shuffler  instead</w:t>
-      </w:r>
-      <w:proofErr w:type="gramEnd"/>
-      <w:r>
-        <w:t xml:space="preserve"> of having a separate button for Hit</w:t>
+        <w:t>adds to the realism of getting a card from the shuffler  instead of having a separate button for Hit</w:t>
       </w:r>
     </w:p>
     <w:p>
@@ -16049,23 +15579,7 @@
         </w:numPr>
       </w:pPr>
       <w:r>
-        <w:t xml:space="preserve">Shuffled deck will be a </w:t>
-      </w:r>
-      <w:proofErr w:type="gramStart"/>
-      <w:r>
-        <w:t>queue</w:t>
-      </w:r>
-      <w:proofErr w:type="gramEnd"/>
-      <w:r>
-        <w:t xml:space="preserve"> and the dealing algorithm will dequeue the “card” at the front of the queue</w:t>
-      </w:r>
-      <w:proofErr w:type="gramStart"/>
-      <w:r>
-        <w:t>/”deck</w:t>
-      </w:r>
-      <w:proofErr w:type="gramEnd"/>
-      <w:r>
-        <w:t>”</w:t>
+        <w:t>Shuffled deck will be a queue and the dealing algorithm will dequeue the “card” at the front of the queue/”deck”</w:t>
       </w:r>
     </w:p>
     <w:p>
@@ -16585,22 +16099,12 @@
         <w:t xml:space="preserve">Determine </w:t>
       </w:r>
       <w:proofErr w:type="spellStart"/>
-      <w:proofErr w:type="gramStart"/>
       <w:r>
         <w:t>win,draw</w:t>
       </w:r>
       <w:proofErr w:type="spellEnd"/>
-      <w:proofErr w:type="gramEnd"/>
-      <w:r>
-        <w:t xml:space="preserve"> or loss for each player based upon each </w:t>
-      </w:r>
-      <w:proofErr w:type="gramStart"/>
-      <w:r>
-        <w:t>players</w:t>
-      </w:r>
-      <w:proofErr w:type="gramEnd"/>
-      <w:r>
-        <w:t xml:space="preserve"> card rankings if player has not Folded</w:t>
+      <w:r>
+        <w:t xml:space="preserve"> or loss for each player based upon each players card rankings if player has not Folded</w:t>
       </w:r>
     </w:p>
     <w:p>
@@ -16735,15 +16239,7 @@
         </w:numPr>
       </w:pPr>
       <w:r>
-        <w:t xml:space="preserve">This is done after the essential parts of the games logic as this will be the most </w:t>
-      </w:r>
-      <w:proofErr w:type="gramStart"/>
-      <w:r>
-        <w:t>time consuming</w:t>
-      </w:r>
-      <w:proofErr w:type="gramEnd"/>
-      <w:r>
-        <w:t xml:space="preserve"> part of this project and for reasons stated further up.</w:t>
+        <w:t>This is done after the essential parts of the games logic as this will be the most time consuming part of this project and for reasons stated further up.</w:t>
       </w:r>
     </w:p>
     <w:p>
@@ -16932,7 +16428,6 @@
           <w:szCs w:val="28"/>
         </w:rPr>
       </w:pPr>
-      <w:proofErr w:type="gramStart"/>
       <w:r>
         <w:rPr>
           <w:i/>
@@ -16958,27 +16453,7 @@
           <w:sz w:val="20"/>
           <w:szCs w:val="20"/>
         </w:rPr>
-        <w:t>(</w:t>
-      </w:r>
-      <w:proofErr w:type="gramEnd"/>
-      <w:r>
-        <w:rPr>
-          <w:i/>
-          <w:iCs/>
-          <w:sz w:val="20"/>
-          <w:szCs w:val="20"/>
-        </w:rPr>
-        <w:t xml:space="preserve">UPPER </w:t>
-      </w:r>
-      <w:proofErr w:type="gramStart"/>
-      <w:r>
-        <w:rPr>
-          <w:i/>
-          <w:iCs/>
-          <w:sz w:val="20"/>
-          <w:szCs w:val="20"/>
-        </w:rPr>
-        <w:t>CASE</w:t>
+        <w:t>(UPPER CASE</w:t>
       </w:r>
       <w:r>
         <w:rPr>
@@ -17005,17 +16480,7 @@
           <w:sz w:val="28"/>
           <w:szCs w:val="28"/>
         </w:rPr>
-        <w:t>X</w:t>
-      </w:r>
-      <w:proofErr w:type="gramEnd"/>
-      <w:r>
-        <w:rPr>
-          <w:i/>
-          <w:iCs/>
-          <w:sz w:val="28"/>
-          <w:szCs w:val="28"/>
-        </w:rPr>
-        <w:t xml:space="preserve"> = number 1-4 just a simplification</w:t>
+        <w:t>X = number 1-4 just a simplification</w:t>
       </w:r>
       <w:r>
         <w:rPr>
@@ -17179,15 +16644,7 @@
               <w:t xml:space="preserve"> </w:t>
             </w:r>
             <w:r>
-              <w:t>[player</w:t>
-            </w:r>
-            <w:proofErr w:type="gramStart"/>
-            <w:r>
-              <w:t>1,player2,player3,player</w:t>
-            </w:r>
-            <w:proofErr w:type="gramEnd"/>
-            <w:r>
-              <w:t>4]</w:t>
+              <w:t>[player1,player2,player3,player4]</w:t>
             </w:r>
           </w:p>
         </w:tc>
@@ -17280,17 +16737,8 @@
               <w:t xml:space="preserve"> = [</w:t>
             </w:r>
             <w:proofErr w:type="spellStart"/>
-            <w:proofErr w:type="gramStart"/>
-            <w:r>
-              <w:t>playerXUser,playerXCurrency</w:t>
-            </w:r>
-            <w:proofErr w:type="gramEnd"/>
-            <w:r>
-              <w:t>,</w:t>
-            </w:r>
-            <w:proofErr w:type="gramStart"/>
-            <w:r>
-              <w:t>playerXCards,</w:t>
+            <w:r>
+              <w:t>playerXUser,playerXCurrency,playerXCards,</w:t>
             </w:r>
             <w:r>
               <w:t>p</w:t>
@@ -17299,7 +16747,6 @@
               <w:t>layerXResult</w:t>
             </w:r>
             <w:proofErr w:type="spellEnd"/>
-            <w:proofErr w:type="gramEnd"/>
             <w:r>
               <w:t>]</w:t>
             </w:r>
@@ -17373,11 +16820,7 @@
               <w:t>of lots of different things</w:t>
             </w:r>
             <w:r>
-              <w:t xml:space="preserve"> for </w:t>
-            </w:r>
-            <w:proofErr w:type="gramStart"/>
-            <w:r>
-              <w:t xml:space="preserve">players </w:t>
+              <w:t xml:space="preserve"> for players </w:t>
             </w:r>
             <w:r>
               <w:t xml:space="preserve"> </w:t>
@@ -17387,7 +16830,6 @@
               <w:t>e.g</w:t>
             </w:r>
             <w:proofErr w:type="spellEnd"/>
-            <w:proofErr w:type="gramEnd"/>
             <w:r>
               <w:t xml:space="preserve"> Poker, Blackjack, Leaderboard etc</w:t>
             </w:r>
@@ -17423,7 +16865,6 @@
               <w:t>dealer = [</w:t>
             </w:r>
             <w:proofErr w:type="spellStart"/>
-            <w:proofErr w:type="gramStart"/>
             <w:r>
               <w:t>dealerUser,</w:t>
             </w:r>
@@ -17431,18 +16872,9 @@
               <w:t>dealers</w:t>
             </w:r>
             <w:r>
-              <w:t>Pot</w:t>
-            </w:r>
-            <w:proofErr w:type="gramEnd"/>
-            <w:r>
-              <w:t>,</w:t>
-            </w:r>
-            <w:proofErr w:type="gramStart"/>
-            <w:r>
-              <w:t>dealerCards,dealerResult</w:t>
+              <w:t>Pot,dealerCards,dealerResult</w:t>
             </w:r>
             <w:proofErr w:type="spellEnd"/>
-            <w:proofErr w:type="gramEnd"/>
             <w:r>
               <w:t>]</w:t>
             </w:r>
@@ -18394,17 +17826,12 @@
               <w:jc w:val="center"/>
             </w:pPr>
             <w:proofErr w:type="spellStart"/>
-            <w:proofErr w:type="gramStart"/>
             <w:r>
               <w:t>ShuffleDeck</w:t>
             </w:r>
             <w:proofErr w:type="spellEnd"/>
             <w:r>
-              <w:t>(</w:t>
-            </w:r>
-            <w:proofErr w:type="gramEnd"/>
-            <w:r>
-              <w:t>)</w:t>
+              <w:t>()</w:t>
             </w:r>
           </w:p>
         </w:tc>
@@ -18469,7 +17896,6 @@
               <w:t>(</w:t>
             </w:r>
             <w:proofErr w:type="spellStart"/>
-            <w:proofErr w:type="gramStart"/>
             <w:r>
               <w:t>playerCards,</w:t>
             </w:r>
@@ -18477,7 +17903,6 @@
               <w:t>nCards</w:t>
             </w:r>
             <w:proofErr w:type="spellEnd"/>
-            <w:proofErr w:type="gramEnd"/>
             <w:r>
               <w:t>)</w:t>
             </w:r>
@@ -18568,12 +17993,10 @@
               <w:t>(</w:t>
             </w:r>
             <w:proofErr w:type="spellStart"/>
-            <w:proofErr w:type="gramStart"/>
             <w:r>
               <w:t>playerCards,nCards</w:t>
             </w:r>
             <w:proofErr w:type="spellEnd"/>
-            <w:proofErr w:type="gramEnd"/>
             <w:r>
               <w:t>)</w:t>
             </w:r>
@@ -18900,14 +18323,12 @@
             <w:pPr>
               <w:jc w:val="center"/>
             </w:pPr>
-            <w:proofErr w:type="gramStart"/>
             <w:r>
               <w:t>ORDERED</w:t>
             </w:r>
             <w:r>
               <w:t>[</w:t>
             </w:r>
-            <w:proofErr w:type="gramEnd"/>
             <w:r>
               <w:t>52]</w:t>
             </w:r>
@@ -18935,13 +18356,8 @@
               <w:jc w:val="center"/>
             </w:pPr>
             <w:r>
-              <w:t xml:space="preserve">Holds an ordered standard deck of (52) cards: </w:t>
-            </w:r>
-            <w:proofErr w:type="gramStart"/>
-            <w:r>
-              <w:t>cards[</w:t>
-            </w:r>
-            <w:proofErr w:type="gramEnd"/>
+              <w:t>Holds an ordered standard deck of (52) cards: cards[</w:t>
+            </w:r>
             <w:r>
               <w:t>13</w:t>
             </w:r>
@@ -18974,7 +18390,6 @@
               <w:jc w:val="center"/>
             </w:pPr>
             <w:proofErr w:type="spellStart"/>
-            <w:proofErr w:type="gramStart"/>
             <w:r>
               <w:t>shu</w:t>
             </w:r>
@@ -18983,11 +18398,7 @@
             </w:r>
             <w:proofErr w:type="spellEnd"/>
             <w:r>
-              <w:t>[</w:t>
-            </w:r>
-            <w:proofErr w:type="gramEnd"/>
-            <w:r>
-              <w:t>52]</w:t>
+              <w:t>[52]</w:t>
             </w:r>
           </w:p>
         </w:tc>
@@ -19658,13 +19069,8 @@
             <w:pPr>
               <w:jc w:val="center"/>
             </w:pPr>
-            <w:proofErr w:type="gramStart"/>
-            <w:r>
-              <w:t>Winnings(</w:t>
-            </w:r>
-            <w:proofErr w:type="gramEnd"/>
-            <w:r>
-              <w:t>)</w:t>
+            <w:r>
+              <w:t>Winnings()</w:t>
             </w:r>
           </w:p>
         </w:tc>
@@ -20800,17 +20206,12 @@
               <w:jc w:val="center"/>
             </w:pPr>
             <w:proofErr w:type="spellStart"/>
-            <w:proofErr w:type="gramStart"/>
             <w:r>
               <w:t>AcS</w:t>
             </w:r>
             <w:proofErr w:type="spellEnd"/>
             <w:r>
-              <w:t>[</w:t>
-            </w:r>
-            <w:proofErr w:type="gramEnd"/>
-            <w:r>
-              <w:t>0] = “</w:t>
+              <w:t>[0] = “</w:t>
             </w:r>
             <w:proofErr w:type="spellStart"/>
             <w:r>
@@ -20869,25 +20270,18 @@
               <w:jc w:val="center"/>
             </w:pPr>
             <w:proofErr w:type="spellStart"/>
-            <w:proofErr w:type="gramStart"/>
             <w:r>
               <w:t>AcS</w:t>
             </w:r>
             <w:proofErr w:type="spellEnd"/>
             <w:r>
-              <w:t>[</w:t>
-            </w:r>
-            <w:proofErr w:type="gramEnd"/>
-            <w:r>
-              <w:t xml:space="preserve">1] = </w:t>
+              <w:t xml:space="preserve">[1] = </w:t>
             </w:r>
             <w:proofErr w:type="spellStart"/>
-            <w:proofErr w:type="gramStart"/>
             <w:r>
               <w:t>screen.blit</w:t>
             </w:r>
             <w:proofErr w:type="spellEnd"/>
-            <w:proofErr w:type="gramEnd"/>
             <w:r>
               <w:t>[image, “ace-of-spades.png”]</w:t>
             </w:r>
@@ -21124,44 +20518,12 @@
           <w:p/>
           <w:p>
             <w:r>
-              <w:t xml:space="preserve">There is a check if there </w:t>
-            </w:r>
-            <w:proofErr w:type="gramStart"/>
-            <w:r>
-              <w:t>is</w:t>
-            </w:r>
-            <w:proofErr w:type="gramEnd"/>
-            <w:r>
-              <w:t xml:space="preserve"> enough cards to give </w:t>
-            </w:r>
-            <w:proofErr w:type="gramStart"/>
-            <w:r>
-              <w:t>out(</w:t>
-            </w:r>
-            <w:proofErr w:type="gramEnd"/>
-            <w:r>
-              <w:t>is the number of cards more than the number of cards in shuffled deck)</w:t>
-            </w:r>
-          </w:p>
-          <w:p>
-            <w:r>
-              <w:t xml:space="preserve">If there aren’t enough </w:t>
-            </w:r>
-            <w:proofErr w:type="gramStart"/>
-            <w:r>
-              <w:t>cards</w:t>
-            </w:r>
-            <w:proofErr w:type="gramEnd"/>
-            <w:r>
-              <w:t xml:space="preserve"> then </w:t>
-            </w:r>
-            <w:proofErr w:type="gramStart"/>
-            <w:r>
-              <w:t>The</w:t>
-            </w:r>
-            <w:proofErr w:type="gramEnd"/>
-            <w:r>
-              <w:t xml:space="preserve"> subroutine ends without dealing any cards</w:t>
+              <w:t>There is a check if there is enough cards to give out(is the number of cards more than the number of cards in shuffled deck)</w:t>
+            </w:r>
+          </w:p>
+          <w:p>
+            <w:r>
+              <w:t>If there aren’t enough cards then The subroutine ends without dealing any cards</w:t>
             </w:r>
             <w:r>
               <w:t xml:space="preserve"> or removing any from the shuffled deck</w:t>
@@ -21170,23 +20532,7 @@
           <w:p/>
           <w:p>
             <w:r>
-              <w:t xml:space="preserve">If there </w:t>
-            </w:r>
-            <w:proofErr w:type="gramStart"/>
-            <w:r>
-              <w:t>is</w:t>
-            </w:r>
-            <w:proofErr w:type="gramEnd"/>
-            <w:r>
-              <w:t xml:space="preserve"> enough </w:t>
-            </w:r>
-            <w:proofErr w:type="gramStart"/>
-            <w:r>
-              <w:t>cards</w:t>
-            </w:r>
-            <w:proofErr w:type="gramEnd"/>
-            <w:r>
-              <w:t xml:space="preserve"> the cards are added to the player</w:t>
+              <w:t>If there is enough cards the cards are added to the player</w:t>
             </w:r>
             <w:r>
               <w:t xml:space="preserve"> (passed as a parameter)</w:t>
@@ -21320,15 +20666,7 @@
           <w:p/>
           <w:p>
             <w:r>
-              <w:t xml:space="preserve">The ordered deck of cards is used to be </w:t>
-            </w:r>
-            <w:proofErr w:type="gramStart"/>
-            <w:r>
-              <w:t>shuffled</w:t>
-            </w:r>
-            <w:proofErr w:type="gramEnd"/>
-            <w:r>
-              <w:t xml:space="preserve"> and the shuffled version is the shuffled deck and the ordered deck remains the same</w:t>
+              <w:t>The ordered deck of cards is used to be shuffled and the shuffled version is the shuffled deck and the ordered deck remains the same</w:t>
             </w:r>
           </w:p>
           <w:p/>
@@ -21460,23 +20798,7 @@
                 <w:b/>
                 <w:bCs/>
               </w:rPr>
-              <w:t xml:space="preserve">Card </w:t>
-            </w:r>
-            <w:proofErr w:type="gramStart"/>
-            <w:r>
-              <w:rPr>
-                <w:b/>
-                <w:bCs/>
-              </w:rPr>
-              <w:t>values(</w:t>
-            </w:r>
-            <w:proofErr w:type="gramEnd"/>
-            <w:r>
-              <w:rPr>
-                <w:b/>
-                <w:bCs/>
-              </w:rPr>
-              <w:t>and suit) Subroutine</w:t>
+              <w:t>Card values(and suit) Subroutine</w:t>
             </w:r>
           </w:p>
         </w:tc>
@@ -21684,23 +21006,7 @@
         </w:numPr>
       </w:pPr>
       <w:r>
-        <w:t xml:space="preserve">Shuffled deck will be a </w:t>
-      </w:r>
-      <w:proofErr w:type="gramStart"/>
-      <w:r>
-        <w:t>queue</w:t>
-      </w:r>
-      <w:proofErr w:type="gramEnd"/>
-      <w:r>
-        <w:t xml:space="preserve"> and the dealing algorithm will dequeue the “card” at the front of the queue</w:t>
-      </w:r>
-      <w:proofErr w:type="gramStart"/>
-      <w:r>
-        <w:t>/”deck</w:t>
-      </w:r>
-      <w:proofErr w:type="gramEnd"/>
-      <w:r>
-        <w:t>”</w:t>
+        <w:t>Shuffled deck will be a queue and the dealing algorithm will dequeue the “card” at the front of the queue/”deck”</w:t>
       </w:r>
     </w:p>
     <w:p>
@@ -21816,21 +21122,7 @@
           <w:rPr>
             <w:rStyle w:val="Hyperlink"/>
           </w:rPr>
-          <w:t xml:space="preserve">Python Random </w:t>
-        </w:r>
-        <w:proofErr w:type="gramStart"/>
-        <w:r>
-          <w:rPr>
-            <w:rStyle w:val="Hyperlink"/>
-          </w:rPr>
-          <w:t>shuffle(</w:t>
-        </w:r>
-        <w:proofErr w:type="gramEnd"/>
-        <w:r>
-          <w:rPr>
-            <w:rStyle w:val="Hyperlink"/>
-          </w:rPr>
-          <w:t>) Method</w:t>
+          <w:t>Python Random shuffle() Method</w:t>
         </w:r>
       </w:hyperlink>
     </w:p>
@@ -21885,7 +21177,7 @@
                 <w:lang w:eastAsia="en-GB"/>
               </w:rPr>
               <w:drawing>
-                <wp:inline distT="0" distB="0" distL="0" distR="0" wp14:anchorId="174E0343" wp14:editId="165ACF07">
+                <wp:inline distT="0" distB="0" distL="0" distR="0" wp14:anchorId="174E0343" wp14:editId="0CDED397">
                   <wp:extent cx="2944994" cy="1211283"/>
                   <wp:effectExtent l="0" t="0" r="8255" b="8255"/>
                   <wp:docPr id="1909004241" name="Picture 1"/>
@@ -22024,13 +21316,8 @@
             </w:r>
           </w:p>
           <w:p>
-            <w:proofErr w:type="gramStart"/>
-            <w:r>
-              <w:t>Ultimately</w:t>
-            </w:r>
-            <w:proofErr w:type="gramEnd"/>
-            <w:r>
-              <w:t xml:space="preserve"> I opted with Picture one as the codes readability is much better and helping with future maintenance and debugging and ease of GUI creation each card will have an image of it assigned to it. </w:t>
+            <w:r>
+              <w:t xml:space="preserve">Ultimately I opted with Picture one as the codes readability is much better and helping with future maintenance and debugging and ease of GUI creation each card will have an image of it assigned to it. </w:t>
             </w:r>
             <w:proofErr w:type="spellStart"/>
             <w:r>
@@ -22159,23 +21446,7 @@
           </w:tcPr>
           <w:p>
             <w:r>
-              <w:t xml:space="preserve">Testing </w:t>
-            </w:r>
-            <w:proofErr w:type="gramStart"/>
-            <w:r>
-              <w:t>this highlighted problems</w:t>
-            </w:r>
-            <w:proofErr w:type="gramEnd"/>
-            <w:r>
-              <w:t xml:space="preserve"> that would </w:t>
-            </w:r>
-            <w:proofErr w:type="gramStart"/>
-            <w:r>
-              <w:t>of</w:t>
-            </w:r>
-            <w:proofErr w:type="gramEnd"/>
-            <w:r>
-              <w:t xml:space="preserve"> caused </w:t>
+              <w:t xml:space="preserve">Testing this highlighted problems that would of caused </w:t>
             </w:r>
             <w:proofErr w:type="spellStart"/>
             <w:r>
@@ -22207,21 +21478,8 @@
               <w:t>e.g</w:t>
             </w:r>
             <w:proofErr w:type="spellEnd"/>
-            <w:proofErr w:type="gramStart"/>
-            <w:r>
-              <w:t xml:space="preserve">   “</w:t>
-            </w:r>
-            <w:proofErr w:type="gramEnd"/>
-            <w:r>
-              <w:t>1</w:t>
-            </w:r>
-            <w:proofErr w:type="gramStart"/>
-            <w:r>
-              <w:t>s”  and</w:t>
-            </w:r>
-            <w:proofErr w:type="gramEnd"/>
-            <w:r>
-              <w:t xml:space="preserve">  “10s”</w:t>
+            <w:r>
+              <w:t xml:space="preserve">   “1s”  and  “10s”</w:t>
             </w:r>
           </w:p>
           <w:p>
@@ -22245,15 +21503,7 @@
               </w:numPr>
             </w:pPr>
             <w:r>
-              <w:t xml:space="preserve">I changed the values such that the first 2 characters indicate the </w:t>
-            </w:r>
-            <w:proofErr w:type="gramStart"/>
-            <w:r>
-              <w:t>value</w:t>
-            </w:r>
-            <w:proofErr w:type="gramEnd"/>
-            <w:r>
-              <w:t xml:space="preserve"> and the last character indicates the suit the suit letter being capitalised as now the face cards and ace are two letters long which means I also capitalise the first letter of them </w:t>
+              <w:t xml:space="preserve">I changed the values such that the first 2 characters indicate the value and the last character indicates the suit the suit letter being capitalised as now the face cards and ace are two letters long which means I also capitalise the first letter of them </w:t>
             </w:r>
             <w:proofErr w:type="spellStart"/>
             <w:r>
@@ -22524,47 +21774,15 @@
                 <w:rFonts w:asciiTheme="majorHAnsi" w:eastAsia="Cambria Math" w:hAnsiTheme="majorHAnsi"/>
                 <w:lang w:eastAsia="ja-JP"/>
               </w:rPr>
-              <w:t>shuffled_</w:t>
-            </w:r>
-            <w:proofErr w:type="gramStart"/>
+              <w:t>shuffled_deck</w:t>
+            </w:r>
+            <w:proofErr w:type="spellEnd"/>
             <w:r>
               <w:rPr>
                 <w:rFonts w:asciiTheme="majorHAnsi" w:eastAsia="Cambria Math" w:hAnsiTheme="majorHAnsi"/>
                 <w:lang w:eastAsia="ja-JP"/>
               </w:rPr>
-              <w:t>deck</w:t>
-            </w:r>
-            <w:proofErr w:type="spellEnd"/>
-            <w:r>
-              <w:rPr>
-                <w:rFonts w:asciiTheme="majorHAnsi" w:eastAsia="Cambria Math" w:hAnsiTheme="majorHAnsi"/>
-                <w:lang w:eastAsia="ja-JP"/>
-              </w:rPr>
-              <w:t xml:space="preserve"> ,</w:t>
-            </w:r>
-            <w:proofErr w:type="gramEnd"/>
-            <w:r>
-              <w:rPr>
-                <w:rFonts w:asciiTheme="majorHAnsi" w:eastAsia="Cambria Math" w:hAnsiTheme="majorHAnsi"/>
-                <w:lang w:eastAsia="ja-JP"/>
-              </w:rPr>
-              <w:t xml:space="preserve"> </w:t>
-            </w:r>
-            <w:proofErr w:type="gramStart"/>
-            <w:r>
-              <w:rPr>
-                <w:rFonts w:asciiTheme="majorHAnsi" w:eastAsia="Cambria Math" w:hAnsiTheme="majorHAnsi"/>
-                <w:lang w:eastAsia="ja-JP"/>
-              </w:rPr>
-              <w:t>head ,</w:t>
-            </w:r>
-            <w:proofErr w:type="gramEnd"/>
-            <w:r>
-              <w:rPr>
-                <w:rFonts w:asciiTheme="majorHAnsi" w:eastAsia="Cambria Math" w:hAnsiTheme="majorHAnsi"/>
-                <w:lang w:eastAsia="ja-JP"/>
-              </w:rPr>
-              <w:t xml:space="preserve"> tail are changed within the function (resetting it to a full deck) and will be used within the other card subroutines.</w:t>
+              <w:t xml:space="preserve"> , head , tail are changed within the function (resetting it to a full deck) and will be used within the other card subroutines.</w:t>
             </w:r>
           </w:p>
           <w:p>
@@ -22580,7 +21798,6 @@
               </w:rPr>
             </w:pPr>
             <w:proofErr w:type="spellStart"/>
-            <w:proofErr w:type="gramStart"/>
             <w:r>
               <w:rPr>
                 <w:rFonts w:asciiTheme="majorHAnsi" w:eastAsia="Cambria Math" w:hAnsiTheme="majorHAnsi"/>
@@ -22589,7 +21806,6 @@
               <w:t>random.shuffle</w:t>
             </w:r>
             <w:proofErr w:type="spellEnd"/>
-            <w:proofErr w:type="gramEnd"/>
             <w:r>
               <w:rPr>
                 <w:rFonts w:asciiTheme="majorHAnsi" w:eastAsia="Cambria Math" w:hAnsiTheme="majorHAnsi"/>
@@ -22623,23 +21839,7 @@
                 <w:rFonts w:asciiTheme="majorHAnsi" w:eastAsia="Cambria Math" w:hAnsiTheme="majorHAnsi"/>
                 <w:lang w:eastAsia="ja-JP"/>
               </w:rPr>
-              <w:t xml:space="preserve">Treating the shuffled cards with a queue like fashion using pointers head and tail where cards will be handed out from the front(head). The tail has no use as of this </w:t>
-            </w:r>
-            <w:proofErr w:type="gramStart"/>
-            <w:r>
-              <w:rPr>
-                <w:rFonts w:asciiTheme="majorHAnsi" w:eastAsia="Cambria Math" w:hAnsiTheme="majorHAnsi"/>
-                <w:lang w:eastAsia="ja-JP"/>
-              </w:rPr>
-              <w:t>time</w:t>
-            </w:r>
-            <w:proofErr w:type="gramEnd"/>
-            <w:r>
-              <w:rPr>
-                <w:rFonts w:asciiTheme="majorHAnsi" w:eastAsia="Cambria Math" w:hAnsiTheme="majorHAnsi"/>
-                <w:lang w:eastAsia="ja-JP"/>
-              </w:rPr>
-              <w:t xml:space="preserve"> but I have instantiated a variable for it for the common standard with a head comes a tail. </w:t>
+              <w:t xml:space="preserve">Treating the shuffled cards with a queue like fashion using pointers head and tail where cards will be handed out from the front(head). The tail has no use as of this time but I have instantiated a variable for it for the common standard with a head comes a tail. </w:t>
             </w:r>
           </w:p>
           <w:p>
@@ -22887,39 +22087,7 @@
                 <w:rFonts w:asciiTheme="majorHAnsi" w:eastAsia="Cambria Math" w:hAnsiTheme="majorHAnsi"/>
                 <w:lang w:eastAsia="ja-JP"/>
               </w:rPr>
-              <w:t>card to a buffer (local) variable called “</w:t>
-            </w:r>
-            <w:proofErr w:type="gramStart"/>
-            <w:r>
-              <w:rPr>
-                <w:rFonts w:asciiTheme="majorHAnsi" w:eastAsia="Cambria Math" w:hAnsiTheme="majorHAnsi"/>
-                <w:lang w:eastAsia="ja-JP"/>
-              </w:rPr>
-              <w:t>card”  then</w:t>
-            </w:r>
-            <w:proofErr w:type="gramEnd"/>
-            <w:r>
-              <w:rPr>
-                <w:rFonts w:asciiTheme="majorHAnsi" w:eastAsia="Cambria Math" w:hAnsiTheme="majorHAnsi"/>
-                <w:lang w:eastAsia="ja-JP"/>
-              </w:rPr>
-              <w:t xml:space="preserve"> removed from the shuffled cards using the </w:t>
-            </w:r>
-            <w:proofErr w:type="gramStart"/>
-            <w:r>
-              <w:rPr>
-                <w:rFonts w:asciiTheme="majorHAnsi" w:eastAsia="Cambria Math" w:hAnsiTheme="majorHAnsi"/>
-                <w:lang w:eastAsia="ja-JP"/>
-              </w:rPr>
-              <w:t>pop(</w:t>
-            </w:r>
-            <w:proofErr w:type="gramEnd"/>
-            <w:r>
-              <w:rPr>
-                <w:rFonts w:asciiTheme="majorHAnsi" w:eastAsia="Cambria Math" w:hAnsiTheme="majorHAnsi"/>
-                <w:lang w:eastAsia="ja-JP"/>
-              </w:rPr>
-              <w:t>) built-in method for list handling.</w:t>
+              <w:t>card to a buffer (local) variable called “card”  then removed from the shuffled cards using the pop() built-in method for list handling.</w:t>
             </w:r>
           </w:p>
           <w:p>
@@ -23109,46 +22277,42 @@
                 <w:rFonts w:asciiTheme="majorHAnsi" w:eastAsia="Cambria Math" w:hAnsiTheme="majorHAnsi"/>
                 <w:lang w:eastAsia="ja-JP"/>
               </w:rPr>
-              <w:t xml:space="preserve">I tested the dealing of the </w:t>
-            </w:r>
-            <w:proofErr w:type="gramStart"/>
+              <w:t xml:space="preserve">I tested the dealing of the cards and it passed without repeating any cards and removing the delt cards from the shuffled list. However it brought to my attention that the total amount of cards left was 48 even though 8 were removed and the total before dealing is supposed to be 52. It turned out I mistakenly included an extra value of cards </w:t>
+            </w:r>
             <w:r>
               <w:rPr>
                 <w:rFonts w:asciiTheme="majorHAnsi" w:eastAsia="Cambria Math" w:hAnsiTheme="majorHAnsi"/>
                 <w:lang w:eastAsia="ja-JP"/>
               </w:rPr>
-              <w:t>cards</w:t>
-            </w:r>
-            <w:proofErr w:type="gramEnd"/>
+              <w:t>["0</w:t>
+            </w:r>
             <w:r>
               <w:rPr>
                 <w:rFonts w:asciiTheme="majorHAnsi" w:eastAsia="Cambria Math" w:hAnsiTheme="majorHAnsi"/>
                 <w:lang w:eastAsia="ja-JP"/>
               </w:rPr>
-              <w:t xml:space="preserve"> and it passed without repeating any cards and removing the delt cards from the shuffled list. </w:t>
-            </w:r>
-            <w:proofErr w:type="gramStart"/>
+              <w:t>1</w:t>
+            </w:r>
             <w:r>
               <w:rPr>
                 <w:rFonts w:asciiTheme="majorHAnsi" w:eastAsia="Cambria Math" w:hAnsiTheme="majorHAnsi"/>
                 <w:lang w:eastAsia="ja-JP"/>
               </w:rPr>
-              <w:t>However</w:t>
-            </w:r>
-            <w:proofErr w:type="gramEnd"/>
+              <w:t>S","0</w:t>
+            </w:r>
             <w:r>
               <w:rPr>
                 <w:rFonts w:asciiTheme="majorHAnsi" w:eastAsia="Cambria Math" w:hAnsiTheme="majorHAnsi"/>
                 <w:lang w:eastAsia="ja-JP"/>
               </w:rPr>
-              <w:t xml:space="preserve"> it brought to my attention that the total amount of cards left was 48 even though 8 were removed and the total before dealing is supposed to be 52. It turned out I mistakenly included an extra value of cards </w:t>
+              <w:t>1</w:t>
             </w:r>
             <w:r>
               <w:rPr>
                 <w:rFonts w:asciiTheme="majorHAnsi" w:eastAsia="Cambria Math" w:hAnsiTheme="majorHAnsi"/>
                 <w:lang w:eastAsia="ja-JP"/>
               </w:rPr>
-              <w:t>["0</w:t>
+              <w:t>H","0</w:t>
             </w:r>
             <w:r>
               <w:rPr>
@@ -23162,7 +22326,7 @@
                 <w:rFonts w:asciiTheme="majorHAnsi" w:eastAsia="Cambria Math" w:hAnsiTheme="majorHAnsi"/>
                 <w:lang w:eastAsia="ja-JP"/>
               </w:rPr>
-              <w:t>S","0</w:t>
+              <w:t>D","0</w:t>
             </w:r>
             <w:r>
               <w:rPr>
@@ -23176,107 +22340,61 @@
                 <w:rFonts w:asciiTheme="majorHAnsi" w:eastAsia="Cambria Math" w:hAnsiTheme="majorHAnsi"/>
                 <w:lang w:eastAsia="ja-JP"/>
               </w:rPr>
-              <w:t>H","0</w:t>
+              <w:t>C"]</w:t>
             </w:r>
             <w:r>
               <w:rPr>
                 <w:rFonts w:asciiTheme="majorHAnsi" w:eastAsia="Cambria Math" w:hAnsiTheme="majorHAnsi"/>
                 <w:lang w:eastAsia="ja-JP"/>
               </w:rPr>
-              <w:t>1</w:t>
-            </w:r>
-            <w:r>
+              <w:t xml:space="preserve"> which do not exist in real life.</w:t>
+            </w:r>
+          </w:p>
+          <w:p>
+            <w:pPr>
               <w:rPr>
                 <w:rFonts w:asciiTheme="majorHAnsi" w:eastAsia="Cambria Math" w:hAnsiTheme="majorHAnsi"/>
                 <w:lang w:eastAsia="ja-JP"/>
               </w:rPr>
-              <w:t>D","0</w:t>
-            </w:r>
+            </w:pPr>
             <w:r>
               <w:rPr>
                 <w:rFonts w:asciiTheme="majorHAnsi" w:eastAsia="Cambria Math" w:hAnsiTheme="majorHAnsi"/>
                 <w:lang w:eastAsia="ja-JP"/>
               </w:rPr>
-              <w:t>1</w:t>
-            </w:r>
+              <w:t xml:space="preserve">I corrected this shortly after and the </w:t>
+            </w:r>
+            <w:proofErr w:type="spellStart"/>
             <w:r>
               <w:rPr>
                 <w:rFonts w:asciiTheme="majorHAnsi" w:eastAsia="Cambria Math" w:hAnsiTheme="majorHAnsi"/>
                 <w:lang w:eastAsia="ja-JP"/>
               </w:rPr>
-              <w:t>C"]</w:t>
-            </w:r>
+              <w:t>DealCards</w:t>
+            </w:r>
+            <w:proofErr w:type="spellEnd"/>
             <w:r>
               <w:rPr>
                 <w:rFonts w:asciiTheme="majorHAnsi" w:eastAsia="Cambria Math" w:hAnsiTheme="majorHAnsi"/>
                 <w:lang w:eastAsia="ja-JP"/>
               </w:rPr>
-              <w:t xml:space="preserve"> which do not exist in real life.</w:t>
-            </w:r>
-          </w:p>
-          <w:p>
-            <w:pPr>
+              <w:t xml:space="preserve">() and </w:t>
+            </w:r>
+            <w:proofErr w:type="spellStart"/>
+            <w:r>
               <w:rPr>
                 <w:rFonts w:asciiTheme="majorHAnsi" w:eastAsia="Cambria Math" w:hAnsiTheme="majorHAnsi"/>
                 <w:lang w:eastAsia="ja-JP"/>
               </w:rPr>
-            </w:pPr>
+              <w:t>ShuffleCards</w:t>
+            </w:r>
+            <w:proofErr w:type="spellEnd"/>
             <w:r>
               <w:rPr>
                 <w:rFonts w:asciiTheme="majorHAnsi" w:eastAsia="Cambria Math" w:hAnsiTheme="majorHAnsi"/>
                 <w:lang w:eastAsia="ja-JP"/>
               </w:rPr>
-              <w:t xml:space="preserve">I corrected this shortly after and the </w:t>
-            </w:r>
-            <w:proofErr w:type="spellStart"/>
-            <w:proofErr w:type="gramStart"/>
-            <w:r>
-              <w:rPr>
-                <w:rFonts w:asciiTheme="majorHAnsi" w:eastAsia="Cambria Math" w:hAnsiTheme="majorHAnsi"/>
-                <w:lang w:eastAsia="ja-JP"/>
-              </w:rPr>
-              <w:t>DealCards</w:t>
-            </w:r>
-            <w:proofErr w:type="spellEnd"/>
-            <w:r>
-              <w:rPr>
-                <w:rFonts w:asciiTheme="majorHAnsi" w:eastAsia="Cambria Math" w:hAnsiTheme="majorHAnsi"/>
-                <w:lang w:eastAsia="ja-JP"/>
-              </w:rPr>
-              <w:t>(</w:t>
-            </w:r>
-            <w:proofErr w:type="gramEnd"/>
-            <w:r>
-              <w:rPr>
-                <w:rFonts w:asciiTheme="majorHAnsi" w:eastAsia="Cambria Math" w:hAnsiTheme="majorHAnsi"/>
-                <w:lang w:eastAsia="ja-JP"/>
-              </w:rPr>
-              <w:t xml:space="preserve">) and </w:t>
-            </w:r>
-            <w:proofErr w:type="spellStart"/>
-            <w:proofErr w:type="gramStart"/>
-            <w:r>
-              <w:rPr>
-                <w:rFonts w:asciiTheme="majorHAnsi" w:eastAsia="Cambria Math" w:hAnsiTheme="majorHAnsi"/>
-                <w:lang w:eastAsia="ja-JP"/>
-              </w:rPr>
-              <w:t>ShuffleCards</w:t>
-            </w:r>
-            <w:proofErr w:type="spellEnd"/>
-            <w:r>
-              <w:rPr>
-                <w:rFonts w:asciiTheme="majorHAnsi" w:eastAsia="Cambria Math" w:hAnsiTheme="majorHAnsi"/>
-                <w:lang w:eastAsia="ja-JP"/>
-              </w:rPr>
-              <w:t>(</w:t>
-            </w:r>
-            <w:proofErr w:type="gramEnd"/>
-            <w:r>
-              <w:rPr>
-                <w:rFonts w:asciiTheme="majorHAnsi" w:eastAsia="Cambria Math" w:hAnsiTheme="majorHAnsi"/>
-                <w:lang w:eastAsia="ja-JP"/>
-              </w:rPr>
-              <w:t>) sub-routines were working as intended.</w:t>
+              <w:t>() sub-routines were working as intended.</w:t>
             </w:r>
           </w:p>
           <w:p/>
@@ -23647,23 +22765,7 @@
                 <w:rFonts w:asciiTheme="majorHAnsi" w:eastAsia="Cambria Math" w:hAnsiTheme="majorHAnsi"/>
                 <w:lang w:eastAsia="ja-JP"/>
               </w:rPr>
-              <w:t xml:space="preserve">Here </w:t>
-            </w:r>
-            <w:proofErr w:type="gramStart"/>
-            <w:r>
-              <w:rPr>
-                <w:rFonts w:asciiTheme="majorHAnsi" w:eastAsia="Cambria Math" w:hAnsiTheme="majorHAnsi"/>
-                <w:lang w:eastAsia="ja-JP"/>
-              </w:rPr>
-              <w:t>is</w:t>
-            </w:r>
-            <w:proofErr w:type="gramEnd"/>
-            <w:r>
-              <w:rPr>
-                <w:rFonts w:asciiTheme="majorHAnsi" w:eastAsia="Cambria Math" w:hAnsiTheme="majorHAnsi"/>
-                <w:lang w:eastAsia="ja-JP"/>
-              </w:rPr>
-              <w:t xml:space="preserve"> the updated lists:</w:t>
+              <w:t>Here is the updated lists:</w:t>
             </w:r>
           </w:p>
           <w:p>
@@ -23999,7 +23101,6 @@
               </w:rPr>
             </w:pPr>
             <w:proofErr w:type="spellStart"/>
-            <w:proofErr w:type="gramStart"/>
             <w:r>
               <w:rPr>
                 <w:rFonts w:asciiTheme="majorHAnsi" w:eastAsia="Cambria Math" w:hAnsiTheme="majorHAnsi"/>
@@ -24013,72 +23114,39 @@
                 <w:rFonts w:asciiTheme="majorHAnsi" w:eastAsia="Cambria Math" w:hAnsiTheme="majorHAnsi"/>
                 <w:lang w:eastAsia="ja-JP"/>
               </w:rPr>
-              <w:t>(</w:t>
-            </w:r>
-            <w:proofErr w:type="gramEnd"/>
+              <w:t xml:space="preserve">() is the subroutine for the card integration feature for the user to handle their own physical deck of cards. It is </w:t>
+            </w:r>
+            <w:proofErr w:type="spellStart"/>
             <w:r>
               <w:rPr>
                 <w:rFonts w:asciiTheme="majorHAnsi" w:eastAsia="Cambria Math" w:hAnsiTheme="majorHAnsi"/>
                 <w:lang w:eastAsia="ja-JP"/>
               </w:rPr>
-              <w:t xml:space="preserve">) is the subroutine for the card integration feature for the user to handle their own physical deck of cards. It is </w:t>
-            </w:r>
-            <w:proofErr w:type="spellStart"/>
+              <w:t>abit</w:t>
+            </w:r>
+            <w:proofErr w:type="spellEnd"/>
             <w:r>
               <w:rPr>
                 <w:rFonts w:asciiTheme="majorHAnsi" w:eastAsia="Cambria Math" w:hAnsiTheme="majorHAnsi"/>
                 <w:lang w:eastAsia="ja-JP"/>
               </w:rPr>
-              <w:t>abit</w:t>
-            </w:r>
-            <w:proofErr w:type="spellEnd"/>
+              <w:t xml:space="preserve"> similar to the </w:t>
+            </w:r>
+            <w:proofErr w:type="spellStart"/>
             <w:r>
               <w:rPr>
                 <w:rFonts w:asciiTheme="majorHAnsi" w:eastAsia="Cambria Math" w:hAnsiTheme="majorHAnsi"/>
                 <w:lang w:eastAsia="ja-JP"/>
               </w:rPr>
-              <w:t xml:space="preserve"> </w:t>
-            </w:r>
-            <w:proofErr w:type="gramStart"/>
+              <w:t>DealCards</w:t>
+            </w:r>
+            <w:proofErr w:type="spellEnd"/>
             <w:r>
               <w:rPr>
                 <w:rFonts w:asciiTheme="majorHAnsi" w:eastAsia="Cambria Math" w:hAnsiTheme="majorHAnsi"/>
                 <w:lang w:eastAsia="ja-JP"/>
               </w:rPr>
-              <w:t>similar to</w:t>
-            </w:r>
-            <w:proofErr w:type="gramEnd"/>
-            <w:r>
-              <w:rPr>
-                <w:rFonts w:asciiTheme="majorHAnsi" w:eastAsia="Cambria Math" w:hAnsiTheme="majorHAnsi"/>
-                <w:lang w:eastAsia="ja-JP"/>
-              </w:rPr>
-              <w:t xml:space="preserve"> the </w:t>
-            </w:r>
-            <w:proofErr w:type="spellStart"/>
-            <w:proofErr w:type="gramStart"/>
-            <w:r>
-              <w:rPr>
-                <w:rFonts w:asciiTheme="majorHAnsi" w:eastAsia="Cambria Math" w:hAnsiTheme="majorHAnsi"/>
-                <w:lang w:eastAsia="ja-JP"/>
-              </w:rPr>
-              <w:t>DealCards</w:t>
-            </w:r>
-            <w:proofErr w:type="spellEnd"/>
-            <w:r>
-              <w:rPr>
-                <w:rFonts w:asciiTheme="majorHAnsi" w:eastAsia="Cambria Math" w:hAnsiTheme="majorHAnsi"/>
-                <w:lang w:eastAsia="ja-JP"/>
-              </w:rPr>
-              <w:t>(</w:t>
-            </w:r>
-            <w:proofErr w:type="gramEnd"/>
-            <w:r>
-              <w:rPr>
-                <w:rFonts w:asciiTheme="majorHAnsi" w:eastAsia="Cambria Math" w:hAnsiTheme="majorHAnsi"/>
-                <w:lang w:eastAsia="ja-JP"/>
-              </w:rPr>
-              <w:t>) sub routine but instead of the system deciding which cards the players are delt the user is doing it.</w:t>
+              <w:t>() sub routine but instead of the system deciding which cards the players are delt the user is doing it.</w:t>
             </w:r>
           </w:p>
           <w:p>
@@ -24098,39 +23166,7 @@
                 <w:rFonts w:asciiTheme="majorHAnsi" w:eastAsia="Cambria Math" w:hAnsiTheme="majorHAnsi"/>
                 <w:lang w:eastAsia="ja-JP"/>
               </w:rPr>
-              <w:t xml:space="preserve">The </w:t>
-            </w:r>
-            <w:proofErr w:type="gramStart"/>
-            <w:r>
-              <w:rPr>
-                <w:rFonts w:asciiTheme="majorHAnsi" w:eastAsia="Cambria Math" w:hAnsiTheme="majorHAnsi"/>
-                <w:lang w:eastAsia="ja-JP"/>
-              </w:rPr>
-              <w:t>remove()  is</w:t>
-            </w:r>
-            <w:proofErr w:type="gramEnd"/>
-            <w:r>
-              <w:rPr>
-                <w:rFonts w:asciiTheme="majorHAnsi" w:eastAsia="Cambria Math" w:hAnsiTheme="majorHAnsi"/>
-                <w:lang w:eastAsia="ja-JP"/>
-              </w:rPr>
-              <w:t xml:space="preserve"> </w:t>
-            </w:r>
-            <w:proofErr w:type="gramStart"/>
-            <w:r>
-              <w:rPr>
-                <w:rFonts w:asciiTheme="majorHAnsi" w:eastAsia="Cambria Math" w:hAnsiTheme="majorHAnsi"/>
-                <w:lang w:eastAsia="ja-JP"/>
-              </w:rPr>
-              <w:t>a another</w:t>
-            </w:r>
-            <w:proofErr w:type="gramEnd"/>
-            <w:r>
-              <w:rPr>
-                <w:rFonts w:asciiTheme="majorHAnsi" w:eastAsia="Cambria Math" w:hAnsiTheme="majorHAnsi"/>
-                <w:lang w:eastAsia="ja-JP"/>
-              </w:rPr>
-              <w:t xml:space="preserve"> built-in python method for list handling. I have used it to remove the instance of that card in shuffled Deck which should replicate the physical deck of cards that the user has remaining. This is why</w:t>
+              <w:t>The remove()  is a another built-in python method for list handling. I have used it to remove the instance of that card in shuffled Deck which should replicate the physical deck of cards that the user has remaining. This is why</w:t>
             </w:r>
             <w:r>
               <w:rPr>
@@ -24188,7 +23224,6 @@
               <w:t>It also adds the card to the players possession in the program. “</w:t>
             </w:r>
             <w:proofErr w:type="spellStart"/>
-            <w:proofErr w:type="gramStart"/>
             <w:r>
               <w:rPr>
                 <w:rFonts w:asciiTheme="majorHAnsi" w:eastAsia="Cambria Math" w:hAnsiTheme="majorHAnsi"/>
@@ -24197,7 +23232,6 @@
               <w:t>player.append</w:t>
             </w:r>
             <w:proofErr w:type="spellEnd"/>
-            <w:proofErr w:type="gramEnd"/>
             <w:r>
               <w:rPr>
                 <w:rFonts w:asciiTheme="majorHAnsi" w:eastAsia="Cambria Math" w:hAnsiTheme="majorHAnsi"/>
@@ -24358,23 +23392,23 @@
                 <w:rFonts w:asciiTheme="majorHAnsi" w:eastAsia="Cambria Math" w:hAnsiTheme="majorHAnsi"/>
                 <w:lang w:eastAsia="ja-JP"/>
               </w:rPr>
-              <w:t xml:space="preserve"> and if </w:t>
-            </w:r>
-            <w:proofErr w:type="gramStart"/>
+              <w:t xml:space="preserve"> and if not they will be prompted to renter a card catching typos, card </w:t>
+            </w:r>
+            <w:proofErr w:type="spellStart"/>
             <w:r>
               <w:rPr>
                 <w:rFonts w:asciiTheme="majorHAnsi" w:eastAsia="Cambria Math" w:hAnsiTheme="majorHAnsi"/>
                 <w:lang w:eastAsia="ja-JP"/>
               </w:rPr>
-              <w:t>not</w:t>
-            </w:r>
-            <w:proofErr w:type="gramEnd"/>
+              <w:t>reptetition</w:t>
+            </w:r>
+            <w:proofErr w:type="spellEnd"/>
             <w:r>
               <w:rPr>
                 <w:rFonts w:asciiTheme="majorHAnsi" w:eastAsia="Cambria Math" w:hAnsiTheme="majorHAnsi"/>
                 <w:lang w:eastAsia="ja-JP"/>
               </w:rPr>
-              <w:t xml:space="preserve"> they will be prompted to renter a card catching typos, card </w:t>
+              <w:t xml:space="preserve"> and </w:t>
             </w:r>
             <w:proofErr w:type="spellStart"/>
             <w:r>
@@ -24382,7 +23416,7 @@
                 <w:rFonts w:asciiTheme="majorHAnsi" w:eastAsia="Cambria Math" w:hAnsiTheme="majorHAnsi"/>
                 <w:lang w:eastAsia="ja-JP"/>
               </w:rPr>
-              <w:t>reptetition</w:t>
+              <w:t>non existing</w:t>
             </w:r>
             <w:proofErr w:type="spellEnd"/>
             <w:r>
@@ -24390,50 +23424,32 @@
                 <w:rFonts w:asciiTheme="majorHAnsi" w:eastAsia="Cambria Math" w:hAnsiTheme="majorHAnsi"/>
                 <w:lang w:eastAsia="ja-JP"/>
               </w:rPr>
-              <w:t xml:space="preserve"> and </w:t>
-            </w:r>
-            <w:proofErr w:type="spellStart"/>
-            <w:r>
+              <w:t xml:space="preserve"> cards. This check uses a while loop. </w:t>
+            </w:r>
+          </w:p>
+          <w:p>
+            <w:pPr>
               <w:rPr>
                 <w:rFonts w:asciiTheme="majorHAnsi" w:eastAsia="Cambria Math" w:hAnsiTheme="majorHAnsi"/>
                 <w:lang w:eastAsia="ja-JP"/>
               </w:rPr>
-              <w:t>non existing</w:t>
-            </w:r>
-            <w:proofErr w:type="spellEnd"/>
+            </w:pPr>
             <w:r>
               <w:rPr>
                 <w:rFonts w:asciiTheme="majorHAnsi" w:eastAsia="Cambria Math" w:hAnsiTheme="majorHAnsi"/>
                 <w:lang w:eastAsia="ja-JP"/>
               </w:rPr>
-              <w:t xml:space="preserve"> cards. This check uses a while loop. </w:t>
-            </w:r>
-          </w:p>
-          <w:p>
-            <w:pPr>
+              <w:t xml:space="preserve">I used the “count” built in list method which will display the number of times a card occurs in the deck. The expected output is 1 if </w:t>
+            </w:r>
+            <w:proofErr w:type="spellStart"/>
+            <w:r>
               <w:rPr>
                 <w:rFonts w:asciiTheme="majorHAnsi" w:eastAsia="Cambria Math" w:hAnsiTheme="majorHAnsi"/>
                 <w:lang w:eastAsia="ja-JP"/>
               </w:rPr>
-            </w:pPr>
-            <w:r>
-              <w:rPr>
-                <w:rFonts w:asciiTheme="majorHAnsi" w:eastAsia="Cambria Math" w:hAnsiTheme="majorHAnsi"/>
-                <w:lang w:eastAsia="ja-JP"/>
-              </w:rPr>
-              <w:t xml:space="preserve">I used the “count” built in list method which will display the number of times a card occurs in the deck. The expected output is 1 if </w:t>
-            </w:r>
-            <w:proofErr w:type="spellStart"/>
-            <w:proofErr w:type="gramStart"/>
-            <w:r>
-              <w:rPr>
-                <w:rFonts w:asciiTheme="majorHAnsi" w:eastAsia="Cambria Math" w:hAnsiTheme="majorHAnsi"/>
-                <w:lang w:eastAsia="ja-JP"/>
-              </w:rPr>
               <w:t>its</w:t>
             </w:r>
             <w:proofErr w:type="spellEnd"/>
-            <w:proofErr w:type="gramEnd"/>
             <w:r>
               <w:rPr>
                 <w:rFonts w:asciiTheme="majorHAnsi" w:eastAsia="Cambria Math" w:hAnsiTheme="majorHAnsi"/>
@@ -24641,7 +23657,7 @@
               </w:rPr>
               <w:lastRenderedPageBreak/>
               <w:drawing>
-                <wp:anchor distT="0" distB="0" distL="114300" distR="114300" simplePos="0" relativeHeight="251674624" behindDoc="0" locked="0" layoutInCell="1" allowOverlap="1" wp14:anchorId="4497E234" wp14:editId="34E02792">
+                <wp:anchor distT="0" distB="0" distL="114300" distR="114300" simplePos="0" relativeHeight="251674624" behindDoc="0" locked="0" layoutInCell="1" allowOverlap="1" wp14:anchorId="4497E234" wp14:editId="5C88F2FE">
                   <wp:simplePos x="0" y="0"/>
                   <wp:positionH relativeFrom="column">
                     <wp:posOffset>-60325</wp:posOffset>
@@ -26237,13 +25253,8 @@
           </w:tcPr>
           <w:p>
             <w:r>
-              <w:t>1.</w:t>
-            </w:r>
-            <w:proofErr w:type="gramStart"/>
-            <w:r>
-              <w:t>1.a</w:t>
-            </w:r>
-            <w:proofErr w:type="gramEnd"/>
+              <w:t>1.1.a</w:t>
+            </w:r>
           </w:p>
         </w:tc>
         <w:tc>
@@ -26306,13 +25317,8 @@
           </w:tcPr>
           <w:p>
             <w:r>
-              <w:t>1.</w:t>
-            </w:r>
-            <w:proofErr w:type="gramStart"/>
-            <w:r>
-              <w:t>1.b</w:t>
-            </w:r>
-            <w:proofErr w:type="gramEnd"/>
+              <w:t>1.1.b</w:t>
+            </w:r>
           </w:p>
         </w:tc>
         <w:tc>
@@ -26439,13 +25445,8 @@
           </w:tcPr>
           <w:p>
             <w:r>
-              <w:t>1.</w:t>
-            </w:r>
-            <w:proofErr w:type="gramStart"/>
-            <w:r>
-              <w:t>2.a</w:t>
-            </w:r>
-            <w:proofErr w:type="gramEnd"/>
+              <w:t>1.2.a</w:t>
+            </w:r>
           </w:p>
         </w:tc>
         <w:tc>
@@ -26513,13 +25514,8 @@
           </w:tcPr>
           <w:p>
             <w:r>
-              <w:t>1.</w:t>
-            </w:r>
-            <w:proofErr w:type="gramStart"/>
-            <w:r>
-              <w:t>2.b</w:t>
-            </w:r>
-            <w:proofErr w:type="gramEnd"/>
+              <w:t>1.2.b</w:t>
+            </w:r>
           </w:p>
         </w:tc>
         <w:tc>
@@ -26627,16 +25623,11 @@
               <w:t>H</w:t>
             </w:r>
             <w:r>
-              <w:t>","KiD</w:t>
-            </w:r>
-            <w:proofErr w:type="gramStart"/>
-            <w:r>
-              <w:t>"</w:t>
+              <w:t>","KiD"</w:t>
             </w:r>
             <w:r>
               <w:t>,etc</w:t>
             </w:r>
-            <w:proofErr w:type="gramEnd"/>
           </w:p>
         </w:tc>
         <w:tc>
@@ -26665,21 +25656,8 @@
               </w:rPr>
               <w:t>–</w:t>
             </w:r>
-            <w:proofErr w:type="gramStart"/>
-            <w:r>
-              <w:t>10,J</w:t>
-            </w:r>
-            <w:proofErr w:type="gramEnd"/>
-            <w:r>
-              <w:t>,</w:t>
-            </w:r>
-            <w:proofErr w:type="gramStart"/>
-            <w:r>
-              <w:t>Q,K</w:t>
-            </w:r>
-            <w:proofErr w:type="gramEnd"/>
-            <w:r>
-              <w:t xml:space="preserve">}, Suit </w:t>
+            <w:r>
+              <w:t xml:space="preserve">10,J,Q,K}, Suit </w:t>
             </w:r>
             <w:r>
               <w:rPr>
@@ -26688,23 +25666,7 @@
               <w:t>∈</w:t>
             </w:r>
             <w:r>
-              <w:t xml:space="preserve"> {</w:t>
-            </w:r>
-            <w:proofErr w:type="gramStart"/>
-            <w:r>
-              <w:t>S,H</w:t>
-            </w:r>
-            <w:proofErr w:type="gramEnd"/>
-            <w:r>
-              <w:t>,</w:t>
-            </w:r>
-            <w:proofErr w:type="gramStart"/>
-            <w:r>
-              <w:t>D,C</w:t>
-            </w:r>
-            <w:proofErr w:type="gramEnd"/>
-            <w:r>
-              <w:t>}</w:t>
+              <w:t xml:space="preserve"> {S,H,D,C}</w:t>
             </w:r>
           </w:p>
         </w:tc>
@@ -26728,13 +25690,8 @@
           </w:tcPr>
           <w:p>
             <w:r>
-              <w:t>1.</w:t>
-            </w:r>
-            <w:proofErr w:type="gramStart"/>
-            <w:r>
-              <w:t>2.d</w:t>
-            </w:r>
-            <w:proofErr w:type="gramEnd"/>
+              <w:t>1.2.d</w:t>
+            </w:r>
           </w:p>
         </w:tc>
         <w:tc>
@@ -26766,25 +25723,12 @@
               <w:t xml:space="preserve">Call </w:t>
             </w:r>
             <w:proofErr w:type="spellStart"/>
-            <w:proofErr w:type="gramStart"/>
             <w:r>
               <w:t>ShuffleCards</w:t>
             </w:r>
             <w:proofErr w:type="spellEnd"/>
             <w:r>
-              <w:t>(</w:t>
-            </w:r>
-            <w:proofErr w:type="gramEnd"/>
-            <w:r>
-              <w:t xml:space="preserve">) then </w:t>
-            </w:r>
-            <w:proofErr w:type="gramStart"/>
-            <w:r>
-              <w:t>compare</w:t>
-            </w:r>
-            <w:proofErr w:type="gramEnd"/>
-            <w:r>
-              <w:t xml:space="preserve"> to original</w:t>
+              <w:t>() then compare to original</w:t>
             </w:r>
           </w:p>
         </w:tc>
@@ -26836,13 +25780,8 @@
           </w:tcPr>
           <w:p>
             <w:r>
-              <w:t>1.</w:t>
-            </w:r>
-            <w:proofErr w:type="gramStart"/>
-            <w:r>
-              <w:t>3.a</w:t>
-            </w:r>
-            <w:proofErr w:type="gramEnd"/>
+              <w:t>1.3.a</w:t>
+            </w:r>
           </w:p>
         </w:tc>
         <w:tc>
@@ -26889,15 +25828,7 @@
           </w:tcPr>
           <w:p>
             <w:r>
-              <w:t>Player</w:t>
-            </w:r>
-            <w:proofErr w:type="gramStart"/>
-            <w:r>
-              <w:t>1  length</w:t>
-            </w:r>
-            <w:proofErr w:type="gramEnd"/>
-            <w:r>
-              <w:t xml:space="preserve"> +1, deck length –1</w:t>
+              <w:t>Player1  length +1, deck length –1</w:t>
             </w:r>
           </w:p>
         </w:tc>
@@ -26921,16 +25852,11 @@
           </w:tcPr>
           <w:p>
             <w:r>
-              <w:t>1.</w:t>
-            </w:r>
-            <w:proofErr w:type="gramStart"/>
-            <w:r>
-              <w:t>3</w:t>
+              <w:t>1.3</w:t>
             </w:r>
             <w:r>
               <w:t>.b</w:t>
             </w:r>
-            <w:proofErr w:type="gramEnd"/>
           </w:p>
         </w:tc>
         <w:tc>
@@ -27098,16 +26024,11 @@
           <w:p>
             <w:r>
               <w:lastRenderedPageBreak/>
-              <w:t>1.</w:t>
-            </w:r>
-            <w:proofErr w:type="gramStart"/>
-            <w:r>
-              <w:t>3</w:t>
+              <w:t>1.3</w:t>
             </w:r>
             <w:r>
               <w:t>.d</w:t>
             </w:r>
-            <w:proofErr w:type="gramEnd"/>
           </w:p>
         </w:tc>
         <w:tc>
@@ -27181,16 +26102,11 @@
           </w:tcPr>
           <w:p>
             <w:r>
-              <w:t>1.</w:t>
-            </w:r>
-            <w:proofErr w:type="gramStart"/>
-            <w:r>
-              <w:t>3</w:t>
+              <w:t>1.3</w:t>
             </w:r>
             <w:r>
               <w:t>.e</w:t>
             </w:r>
-            <w:proofErr w:type="gramEnd"/>
           </w:p>
         </w:tc>
         <w:tc>
@@ -27232,18 +26148,10 @@
             </w:r>
             <w:proofErr w:type="spellEnd"/>
             <w:r>
-              <w:t>(p</w:t>
-            </w:r>
-            <w:proofErr w:type="gramStart"/>
-            <w:r>
-              <w:t>1,</w:t>
-            </w:r>
-            <w:r>
-              <w:t>-</w:t>
-            </w:r>
-            <w:proofErr w:type="gramEnd"/>
-            <w:r>
-              <w:t>3</w:t>
+              <w:t>(p1,</w:t>
+            </w:r>
+            <w:r>
+              <w:t>-3</w:t>
             </w:r>
             <w:r>
               <w:t>)</w:t>
@@ -27280,16 +26188,11 @@
           </w:tcPr>
           <w:p>
             <w:r>
-              <w:t>1.</w:t>
-            </w:r>
-            <w:proofErr w:type="gramStart"/>
-            <w:r>
-              <w:t>3</w:t>
+              <w:t>1.3</w:t>
             </w:r>
             <w:r>
               <w:t>.f</w:t>
             </w:r>
-            <w:proofErr w:type="gramEnd"/>
           </w:p>
         </w:tc>
         <w:tc>
@@ -27358,13 +26261,8 @@
           </w:tcPr>
           <w:p>
             <w:r>
-              <w:t>1.</w:t>
-            </w:r>
-            <w:proofErr w:type="gramStart"/>
-            <w:r>
-              <w:t>2.post</w:t>
-            </w:r>
-            <w:proofErr w:type="gramEnd"/>
+              <w:t>1.2.post</w:t>
+            </w:r>
           </w:p>
         </w:tc>
         <w:tc>
@@ -27396,7 +26294,6 @@
               <w:t xml:space="preserve">Run </w:t>
             </w:r>
             <w:proofErr w:type="spellStart"/>
-            <w:proofErr w:type="gramStart"/>
             <w:r>
               <w:t>S</w:t>
             </w:r>
@@ -27408,11 +26305,7 @@
             </w:r>
             <w:proofErr w:type="spellEnd"/>
             <w:r>
-              <w:t>(</w:t>
-            </w:r>
-            <w:proofErr w:type="gramEnd"/>
-            <w:r>
-              <w:t>)</w:t>
+              <w:t>()</w:t>
             </w:r>
             <w:r>
               <w:t xml:space="preserve"> 100×</w:t>
@@ -27437,15 +26330,7 @@
           </w:tcPr>
           <w:p>
             <w:r>
-              <w:t xml:space="preserve">No duplicates within a deck, </w:t>
-            </w:r>
-            <w:proofErr w:type="gramStart"/>
-            <w:r>
-              <w:t>the greater majority of</w:t>
-            </w:r>
-            <w:proofErr w:type="gramEnd"/>
-            <w:r>
-              <w:t xml:space="preserve"> shuffled decks must be unique</w:t>
+              <w:t>No duplicates within a deck, the greater majority of shuffled decks must be unique</w:t>
             </w:r>
           </w:p>
         </w:tc>
@@ -27691,15 +26576,7 @@
             </w:r>
             <w:proofErr w:type="spellEnd"/>
             <w:r>
-              <w:t xml:space="preserve"> index for each player. This will be used </w:t>
-            </w:r>
-            <w:proofErr w:type="gramStart"/>
-            <w:r>
-              <w:t>later on</w:t>
-            </w:r>
-            <w:proofErr w:type="gramEnd"/>
-            <w:r>
-              <w:t xml:space="preserve"> to calculate the players winnings. </w:t>
+              <w:t xml:space="preserve"> index for each player. This will be used later on to calculate the players winnings. </w:t>
             </w:r>
           </w:p>
           <w:p/>
@@ -27716,15 +26593,7 @@
           <w:p/>
           <w:p>
             <w:r>
-              <w:t xml:space="preserve">The subroutine </w:t>
-            </w:r>
-            <w:proofErr w:type="gramStart"/>
-            <w:r>
-              <w:t>is stops</w:t>
-            </w:r>
-            <w:proofErr w:type="gramEnd"/>
-            <w:r>
-              <w:t xml:space="preserve"> after assigning each bet to </w:t>
+              <w:t xml:space="preserve">The subroutine is stops after assigning each bet to </w:t>
             </w:r>
             <w:proofErr w:type="spellStart"/>
             <w:r>
@@ -27732,15 +26601,7 @@
             </w:r>
             <w:proofErr w:type="spellEnd"/>
             <w:r>
-              <w:t xml:space="preserve"> and removing it from </w:t>
-            </w:r>
-            <w:proofErr w:type="gramStart"/>
-            <w:r>
-              <w:t>the each</w:t>
-            </w:r>
-            <w:proofErr w:type="gramEnd"/>
-            <w:r>
-              <w:t xml:space="preserve"> players currency.</w:t>
+              <w:t xml:space="preserve"> and removing it from the each players currency.</w:t>
             </w:r>
           </w:p>
         </w:tc>
@@ -27831,15 +26692,7 @@
           </w:tcPr>
           <w:p>
             <w:r>
-              <w:t xml:space="preserve">This subroutine is used to take in every </w:t>
-            </w:r>
-            <w:proofErr w:type="gramStart"/>
-            <w:r>
-              <w:t>players</w:t>
-            </w:r>
-            <w:proofErr w:type="gramEnd"/>
-            <w:r>
-              <w:t xml:space="preserve"> round input and takes in the parameter “players”.</w:t>
+              <w:t>This subroutine is used to take in every players round input and takes in the parameter “players”.</w:t>
             </w:r>
           </w:p>
           <w:p>
@@ -27858,36 +26711,15 @@
           <w:p/>
           <w:p>
             <w:r>
-              <w:t xml:space="preserve">If the players input is </w:t>
-            </w:r>
-            <w:proofErr w:type="gramStart"/>
-            <w:r>
-              <w:t>stand</w:t>
-            </w:r>
-            <w:proofErr w:type="gramEnd"/>
-            <w:r>
-              <w:t xml:space="preserve"> their turn has ended and it will proceed to the next players turn. If it is hit it will deal the player another singular card using the “</w:t>
+              <w:t>If the players input is stand their turn has ended and it will proceed to the next players turn. If it is hit it will deal the player another singular card using the “</w:t>
             </w:r>
             <w:proofErr w:type="spellStart"/>
-            <w:proofErr w:type="gramStart"/>
             <w:r>
               <w:t>DealCards</w:t>
             </w:r>
             <w:proofErr w:type="spellEnd"/>
             <w:r>
-              <w:t>(</w:t>
-            </w:r>
-            <w:proofErr w:type="gramEnd"/>
-            <w:r>
-              <w:t xml:space="preserve">)” subroutine output the players cards including the newly added card. If the total value of the cards exceeds 21 the player goes bust and is loses out on possible winnings. If the total doesn’t exceed </w:t>
-            </w:r>
-            <w:proofErr w:type="gramStart"/>
-            <w:r>
-              <w:t>21</w:t>
-            </w:r>
-            <w:proofErr w:type="gramEnd"/>
-            <w:r>
-              <w:t xml:space="preserve"> they are given the option to hit or stand until their cards total value exceeds 21 or they stand Then moving onto the n </w:t>
+              <w:t xml:space="preserve">()” subroutine output the players cards including the newly added card. If the total value of the cards exceeds 21 the player goes bust and is loses out on possible winnings. If the total doesn’t exceed 21 they are given the option to hit or stand until their cards total value exceeds 21 or they stand Then moving onto the n </w:t>
             </w:r>
             <w:proofErr w:type="spellStart"/>
             <w:r>
@@ -27906,15 +26738,7 @@
             </w:r>
             <w:proofErr w:type="spellEnd"/>
             <w:r>
-              <w:t xml:space="preserve"> will be used </w:t>
-            </w:r>
-            <w:proofErr w:type="gramStart"/>
-            <w:r>
-              <w:t>later on</w:t>
-            </w:r>
-            <w:proofErr w:type="gramEnd"/>
-            <w:r>
-              <w:t xml:space="preserve"> to calculate the winnings for each player.</w:t>
+              <w:t xml:space="preserve"> will be used later on to calculate the winnings for each player.</w:t>
             </w:r>
           </w:p>
           <w:p/>
@@ -28024,51 +26848,17 @@
               <w:t xml:space="preserve">The subroutine loops through each player and decides which players </w:t>
             </w:r>
             <w:proofErr w:type="spellStart"/>
-            <w:proofErr w:type="gramStart"/>
             <w:r>
               <w:t>win,lose</w:t>
             </w:r>
             <w:proofErr w:type="spellEnd"/>
-            <w:proofErr w:type="gramEnd"/>
             <w:r>
               <w:t xml:space="preserve"> or draw depending on the dealers and the individual players card totals.</w:t>
             </w:r>
           </w:p>
           <w:p>
             <w:r>
-              <w:t xml:space="preserve">If a player has already gone </w:t>
-            </w:r>
-            <w:proofErr w:type="gramStart"/>
-            <w:r>
-              <w:t>bust</w:t>
-            </w:r>
-            <w:proofErr w:type="gramEnd"/>
-            <w:r>
-              <w:t xml:space="preserve"> then they are automatically skipped as they have already lost. If the </w:t>
-            </w:r>
-            <w:proofErr w:type="gramStart"/>
-            <w:r>
-              <w:t>dealers</w:t>
-            </w:r>
-            <w:proofErr w:type="gramEnd"/>
-            <w:r>
-              <w:t xml:space="preserve"> cards exceed 21 then all players automatically win other than those who went “bust”. </w:t>
-            </w:r>
-            <w:proofErr w:type="gramStart"/>
-            <w:r>
-              <w:t>Otherwise</w:t>
-            </w:r>
-            <w:proofErr w:type="gramEnd"/>
-            <w:r>
-              <w:t xml:space="preserve"> if the players card total is equal to the </w:t>
-            </w:r>
-            <w:proofErr w:type="gramStart"/>
-            <w:r>
-              <w:t>dealers</w:t>
-            </w:r>
-            <w:proofErr w:type="gramEnd"/>
-            <w:r>
-              <w:t xml:space="preserve"> then it is a draw. If it less than the dealers it</w:t>
+              <w:t>If a player has already gone bust then they are automatically skipped as they have already lost. If the dealers cards exceed 21 then all players automatically win other than those who went “bust”. Otherwise if the players card total is equal to the dealers then it is a draw. If it less than the dealers it</w:t>
             </w:r>
             <w:r>
               <w:t xml:space="preserve"> is a loss and if </w:t>
@@ -28090,13 +26880,8 @@
             </w:r>
             <w:proofErr w:type="spellEnd"/>
             <w:r>
-              <w:t xml:space="preserve"> will be used to calculate the winnings </w:t>
-            </w:r>
-            <w:proofErr w:type="gramStart"/>
-            <w:r>
-              <w:t>later on</w:t>
-            </w:r>
-            <w:proofErr w:type="gramEnd"/>
+              <w:t xml:space="preserve"> will be used to calculate the winnings later on</w:t>
+            </w:r>
           </w:p>
         </w:tc>
       </w:tr>
@@ -28142,7 +26927,7 @@
               </w:rPr>
               <w:lastRenderedPageBreak/>
               <w:drawing>
-                <wp:inline distT="0" distB="0" distL="0" distR="0" wp14:anchorId="64B8FB74" wp14:editId="27925C00">
+                <wp:inline distT="0" distB="0" distL="0" distR="0" wp14:anchorId="64B8FB74" wp14:editId="1077BC8C">
                   <wp:extent cx="2588724" cy="7174236"/>
                   <wp:effectExtent l="0" t="0" r="2540" b="7620"/>
                   <wp:docPr id="826538610" name="Picture 2"/>
@@ -28255,17 +27040,12 @@
               <w:t xml:space="preserve">The </w:t>
             </w:r>
             <w:proofErr w:type="spellStart"/>
-            <w:proofErr w:type="gramStart"/>
             <w:r>
               <w:t>BlackjackRound</w:t>
             </w:r>
             <w:proofErr w:type="spellEnd"/>
             <w:r>
-              <w:t>(</w:t>
-            </w:r>
-            <w:proofErr w:type="gramEnd"/>
-            <w:r>
-              <w:t>) subroutine takes in players and dealer as a subroutine. It calls upon all the subroutines above in order with its own code to produce a full singular round of blackjack.</w:t>
+              <w:t>() subroutine takes in players and dealer as a subroutine. It calls upon all the subroutines above in order with its own code to produce a full singular round of blackjack.</w:t>
             </w:r>
           </w:p>
           <w:p/>
@@ -28274,30 +27054,17 @@
               <w:t>*</w:t>
             </w:r>
             <w:proofErr w:type="spellStart"/>
-            <w:proofErr w:type="gramStart"/>
             <w:r>
               <w:t>ShuffleDeck</w:t>
             </w:r>
             <w:proofErr w:type="spellEnd"/>
             <w:r>
-              <w:t>(</w:t>
-            </w:r>
-            <w:proofErr w:type="gramEnd"/>
-            <w:r>
-              <w:t>)</w:t>
-            </w:r>
-          </w:p>
-          <w:p>
-            <w:r>
-              <w:t xml:space="preserve">At the start of each </w:t>
-            </w:r>
-            <w:proofErr w:type="gramStart"/>
-            <w:r>
-              <w:t>round</w:t>
-            </w:r>
-            <w:proofErr w:type="gramEnd"/>
-            <w:r>
-              <w:t xml:space="preserve"> it reshuffles the deck and resets certain variables (</w:t>
+              <w:t>()</w:t>
+            </w:r>
+          </w:p>
+          <w:p>
+            <w:r>
+              <w:t>At the start of each round it reshuffles the deck and resets certain variables (</w:t>
             </w:r>
             <w:proofErr w:type="spellStart"/>
             <w:r>
@@ -28324,25 +27091,12 @@
               <w:t xml:space="preserve">It then calls upon </w:t>
             </w:r>
             <w:proofErr w:type="spellStart"/>
-            <w:proofErr w:type="gramStart"/>
             <w:r>
               <w:t>BlackjackAnte</w:t>
             </w:r>
             <w:proofErr w:type="spellEnd"/>
             <w:r>
-              <w:t>(</w:t>
-            </w:r>
-            <w:proofErr w:type="gramEnd"/>
-            <w:r>
-              <w:t xml:space="preserve">) to input each </w:t>
-            </w:r>
-            <w:proofErr w:type="gramStart"/>
-            <w:r>
-              <w:t>players</w:t>
-            </w:r>
-            <w:proofErr w:type="gramEnd"/>
-            <w:r>
-              <w:t xml:space="preserve"> initial bet and </w:t>
+              <w:t xml:space="preserve">() to input each players initial bet and </w:t>
             </w:r>
             <w:proofErr w:type="spellStart"/>
             <w:r>
@@ -28359,46 +27113,20 @@
               <w:t xml:space="preserve">It then checks if the user will be integrating their own deck of cards, if so </w:t>
             </w:r>
             <w:proofErr w:type="spellStart"/>
-            <w:proofErr w:type="gramStart"/>
             <w:r>
               <w:t>CardIntegration</w:t>
             </w:r>
             <w:proofErr w:type="spellEnd"/>
             <w:r>
-              <w:t>(</w:t>
-            </w:r>
-            <w:proofErr w:type="gramEnd"/>
-            <w:r>
-              <w:t xml:space="preserve">) will be called upon to set up each </w:t>
-            </w:r>
-            <w:proofErr w:type="gramStart"/>
-            <w:r>
-              <w:t>players</w:t>
-            </w:r>
-            <w:proofErr w:type="gramEnd"/>
-            <w:r>
-              <w:t xml:space="preserve"> deck. If </w:t>
-            </w:r>
-            <w:proofErr w:type="gramStart"/>
-            <w:r>
-              <w:t>not</w:t>
-            </w:r>
-            <w:proofErr w:type="gramEnd"/>
-            <w:r>
-              <w:t xml:space="preserve"> then </w:t>
+              <w:t xml:space="preserve">() will be called upon to set up each players deck. If not then </w:t>
             </w:r>
             <w:proofErr w:type="spellStart"/>
-            <w:proofErr w:type="gramStart"/>
             <w:r>
               <w:t>DealCards</w:t>
             </w:r>
             <w:proofErr w:type="spellEnd"/>
             <w:r>
-              <w:t>(</w:t>
-            </w:r>
-            <w:proofErr w:type="gramEnd"/>
-            <w:r>
-              <w:t>) will be called upon to deal each player a deck of 2 cards.</w:t>
+              <w:t>() will be called upon to deal each player a deck of 2 cards.</w:t>
             </w:r>
           </w:p>
         </w:tc>
@@ -28467,17 +27195,12 @@
           <w:p/>
           <w:p>
             <w:proofErr w:type="spellStart"/>
-            <w:proofErr w:type="gramStart"/>
             <w:r>
               <w:t>BlackjackHitStandCycle</w:t>
             </w:r>
             <w:proofErr w:type="spellEnd"/>
             <w:r>
-              <w:t>(</w:t>
-            </w:r>
-            <w:proofErr w:type="gramEnd"/>
-            <w:r>
-              <w:t>) is called upon cycling through each players turn and deals with their inputs accordingly.</w:t>
+              <w:t>() is called upon cycling through each players turn and deals with their inputs accordingly.</w:t>
             </w:r>
           </w:p>
           <w:p/>
@@ -28516,77 +27239,62 @@
           <w:p/>
           <w:p>
             <w:proofErr w:type="spellStart"/>
-            <w:proofErr w:type="gramStart"/>
             <w:r>
               <w:t>BlackjackResult</w:t>
             </w:r>
             <w:proofErr w:type="spellEnd"/>
             <w:r>
-              <w:t>(</w:t>
-            </w:r>
-            <w:proofErr w:type="gramEnd"/>
-            <w:r>
-              <w:t>) is called upon to calculate the rounds result depending on card totals.</w:t>
+              <w:t>() is called upon to calculate the rounds result depending on card totals.</w:t>
             </w:r>
           </w:p>
           <w:p/>
           <w:p>
             <w:proofErr w:type="spellStart"/>
-            <w:proofErr w:type="gramStart"/>
             <w:r>
               <w:t>CalculateWinnings</w:t>
             </w:r>
             <w:proofErr w:type="spellEnd"/>
             <w:r>
-              <w:t>(</w:t>
-            </w:r>
-            <w:proofErr w:type="gramEnd"/>
+              <w:t>()</w:t>
+            </w:r>
+            <w:r>
+              <w:t xml:space="preserve"> is then called upon to calculate each players winnings and add it to their currency depending on </w:t>
+            </w:r>
+            <w:r>
+              <w:t>each players</w:t>
+            </w:r>
+            <w:r>
+              <w:t xml:space="preserve"> </w:t>
+            </w:r>
+            <w:r>
+              <w:t xml:space="preserve">ante bet (values within </w:t>
+            </w:r>
+            <w:proofErr w:type="spellStart"/>
+            <w:r>
+              <w:t>dealersPot</w:t>
+            </w:r>
+            <w:proofErr w:type="spellEnd"/>
             <w:r>
               <w:t>)</w:t>
             </w:r>
             <w:r>
-              <w:t xml:space="preserve"> is then called upon to calculate each players winnings and add it to their currency depending on </w:t>
-            </w:r>
-            <w:r>
-              <w:t>each players</w:t>
-            </w:r>
-            <w:r>
-              <w:t xml:space="preserve"> </w:t>
-            </w:r>
-            <w:r>
-              <w:t xml:space="preserve">ante bet (values within </w:t>
+              <w:t xml:space="preserve"> and </w:t>
             </w:r>
             <w:proofErr w:type="spellStart"/>
             <w:r>
-              <w:t>dealersPot</w:t>
+              <w:t>playerResult</w:t>
             </w:r>
             <w:proofErr w:type="spellEnd"/>
             <w:r>
-              <w:t>)</w:t>
-            </w:r>
-            <w:r>
-              <w:t xml:space="preserve"> and </w:t>
+              <w:t xml:space="preserve"> from </w:t>
             </w:r>
             <w:proofErr w:type="spellStart"/>
             <w:r>
-              <w:t>playerResult</w:t>
+              <w:t>BlackjackResult</w:t>
             </w:r>
             <w:proofErr w:type="spellEnd"/>
             <w:r>
-              <w:t xml:space="preserve"> from </w:t>
-            </w:r>
-            <w:proofErr w:type="spellStart"/>
-            <w:proofErr w:type="gramStart"/>
-            <w:r>
-              <w:t>BlackjackResult</w:t>
-            </w:r>
-            <w:proofErr w:type="spellEnd"/>
-            <w:r>
-              <w:t>(</w:t>
-            </w:r>
-            <w:proofErr w:type="gramEnd"/>
-            <w:r>
-              <w:t>)</w:t>
+              <w:t>()</w:t>
             </w:r>
           </w:p>
           <w:p/>
@@ -28767,28 +27475,15 @@
               <w:t xml:space="preserve">This is the subroutine for the </w:t>
             </w:r>
             <w:r>
-              <w:t xml:space="preserve">initial “ante” bet in blackjack. I decided to have the dealers pot as a list of </w:t>
-            </w:r>
-            <w:proofErr w:type="gramStart"/>
-            <w:r>
-              <w:t xml:space="preserve">4  </w:t>
+              <w:t xml:space="preserve">initial “ante” bet in blackjack. I decided to have the dealers pot as a list of 4  </w:t>
             </w:r>
             <w:proofErr w:type="spellStart"/>
             <w:r>
               <w:t>indexs</w:t>
             </w:r>
             <w:proofErr w:type="spellEnd"/>
-            <w:proofErr w:type="gramEnd"/>
-            <w:r>
-              <w:t xml:space="preserve"> for the 4 different players as it will be able to hold and distinguish which bet is whose. When playing </w:t>
-            </w:r>
-            <w:proofErr w:type="gramStart"/>
-            <w:r>
-              <w:t>poker</w:t>
-            </w:r>
-            <w:proofErr w:type="gramEnd"/>
-            <w:r>
-              <w:t xml:space="preserve"> the </w:t>
+            <w:r>
+              <w:t xml:space="preserve"> for the 4 different players as it will be able to hold and distinguish which bet is whose. When playing poker the </w:t>
             </w:r>
             <w:proofErr w:type="spellStart"/>
             <w:r>
@@ -28867,15 +27562,7 @@
           </w:tcPr>
           <w:p>
             <w:r>
-              <w:t xml:space="preserve">I added </w:t>
-            </w:r>
-            <w:proofErr w:type="gramStart"/>
-            <w:r>
-              <w:t>int(</w:t>
-            </w:r>
-            <w:proofErr w:type="gramEnd"/>
-            <w:r>
-              <w:t xml:space="preserve">…) around input to make sure calculations are not made with string versions of the input </w:t>
+              <w:t xml:space="preserve">I added int(…) around input to make sure calculations are not made with string versions of the input </w:t>
             </w:r>
             <w:proofErr w:type="spellStart"/>
             <w:r>
@@ -29056,15 +27743,7 @@
               <w:t xml:space="preserve">it </w:t>
             </w:r>
             <w:r>
-              <w:t>couldn’t concatenate “Your currency</w:t>
-            </w:r>
-            <w:proofErr w:type="gramStart"/>
-            <w:r>
-              <w:t>: ”</w:t>
-            </w:r>
-            <w:proofErr w:type="gramEnd"/>
-            <w:r>
-              <w:t xml:space="preserve"> with the integer currency.</w:t>
+              <w:t>couldn’t concatenate “Your currency: ” with the integer currency.</w:t>
             </w:r>
           </w:p>
           <w:p/>
@@ -29077,25 +27756,12 @@
           <w:p/>
           <w:p>
             <w:r>
-              <w:t xml:space="preserve">I tried changing the + into </w:t>
-            </w:r>
-            <w:proofErr w:type="gramStart"/>
-            <w:r>
-              <w:t>a ,</w:t>
-            </w:r>
-            <w:proofErr w:type="gramEnd"/>
-            <w:r>
-              <w:t xml:space="preserve"> which fixed the problem.</w:t>
-            </w:r>
-          </w:p>
-          <w:p>
-            <w:proofErr w:type="gramStart"/>
-            <w:r>
-              <w:t>However</w:t>
-            </w:r>
-            <w:proofErr w:type="gramEnd"/>
-            <w:r>
-              <w:t xml:space="preserve"> opted to </w:t>
+              <w:t>I tried changing the + into a , which fixed the problem.</w:t>
+            </w:r>
+          </w:p>
+          <w:p>
+            <w:r>
+              <w:t xml:space="preserve">However opted to </w:t>
             </w:r>
             <w:r>
               <w:t>changing the currency to a string value when being printed which fixed the problem</w:t>
@@ -29334,8 +28000,6 @@
             </w:r>
             <w:r>
               <w:br/>
-            </w:r>
-            <w:r>
               <w:t>I also forgot to add [</w:t>
             </w:r>
             <w:proofErr w:type="spellStart"/>
@@ -29344,10 +28008,7 @@
             </w:r>
             <w:proofErr w:type="spellEnd"/>
             <w:r>
-              <w:t>] at the end of dealers pot when subtracting it from the players currency</w:t>
-            </w:r>
-            <w:r>
-              <w:t xml:space="preserve"> so I added this.</w:t>
+              <w:t>] at the end of dealers pot when subtracting it from the players currency so I added this.</w:t>
             </w:r>
           </w:p>
           <w:p/>
@@ -29927,17 +28588,12 @@
           </w:tcPr>
           <w:p>
             <w:proofErr w:type="spellStart"/>
-            <w:proofErr w:type="gramStart"/>
             <w:r>
               <w:t>BlackjackResult</w:t>
             </w:r>
             <w:proofErr w:type="spellEnd"/>
             <w:r>
-              <w:t>(</w:t>
-            </w:r>
-            <w:proofErr w:type="gramEnd"/>
-            <w:r>
-              <w:t>) subroutine</w:t>
+              <w:t>() subroutine</w:t>
             </w:r>
           </w:p>
         </w:tc>
@@ -30194,17 +28850,12 @@
               <w:t xml:space="preserve">I have indicated the </w:t>
             </w:r>
             <w:proofErr w:type="spellStart"/>
-            <w:proofErr w:type="gramStart"/>
             <w:r>
               <w:t>CalculateWinnings</w:t>
             </w:r>
             <w:proofErr w:type="spellEnd"/>
             <w:r>
-              <w:t>(</w:t>
-            </w:r>
-            <w:proofErr w:type="gramEnd"/>
-            <w:r>
-              <w:t xml:space="preserve">) subroutine slots in underneath </w:t>
+              <w:t xml:space="preserve">() subroutine slots in underneath </w:t>
             </w:r>
             <w:proofErr w:type="spellStart"/>
             <w:r>
@@ -30395,15 +29046,7 @@
               <w:br/>
             </w:r>
             <w:r>
-              <w:t xml:space="preserve">I realised I forgot to output one of the dealers </w:t>
-            </w:r>
-            <w:proofErr w:type="gramStart"/>
-            <w:r>
-              <w:t>card</w:t>
-            </w:r>
-            <w:proofErr w:type="gramEnd"/>
-            <w:r>
-              <w:t xml:space="preserve"> after all cards have been delt before players take their turn which is part of blackjacks gameplay. I </w:t>
+              <w:t xml:space="preserve">I realised I forgot to output one of the dealers card after all cards have been delt before players take their turn which is part of blackjacks gameplay. I </w:t>
             </w:r>
             <w:r>
               <w:t xml:space="preserve">also </w:t>
@@ -30416,15 +29059,7 @@
             </w:r>
             <w:r>
               <w:br/>
-              <w:t xml:space="preserve">I also decided instead of returning “players” and “dealer” all the </w:t>
-            </w:r>
-            <w:proofErr w:type="gramStart"/>
-            <w:r>
-              <w:t>subroutine</w:t>
-            </w:r>
-            <w:proofErr w:type="gramEnd"/>
-            <w:r>
-              <w:t xml:space="preserve"> will return is each players currency as this is the only thing carried </w:t>
+              <w:t xml:space="preserve">I also decided instead of returning “players” and “dealer” all the subroutine will return is each players currency as this is the only thing carried </w:t>
             </w:r>
             <w:r>
               <w:t>out of the round into the next round or poker round</w:t>
@@ -30733,64 +29368,57 @@
           </w:tcPr>
           <w:p>
             <w:proofErr w:type="spellStart"/>
-            <w:proofErr w:type="gramStart"/>
             <w:r>
               <w:t>BlackjackAnte</w:t>
             </w:r>
             <w:proofErr w:type="spellEnd"/>
             <w:r>
+              <w:t>()</w:t>
+            </w:r>
+          </w:p>
+        </w:tc>
+        <w:tc>
+          <w:tcPr>
+            <w:tcW w:w="1292" w:type="dxa"/>
+          </w:tcPr>
+          <w:p>
+            <w:r>
+              <w:t>Validation</w:t>
+            </w:r>
+          </w:p>
+        </w:tc>
+        <w:tc>
+          <w:tcPr>
+            <w:tcW w:w="2478" w:type="dxa"/>
+          </w:tcPr>
+          <w:p>
+            <w:r>
+              <w:t>print(players[</w:t>
+            </w:r>
+            <w:proofErr w:type="spellStart"/>
+            <w:r>
+              <w:t>i</w:t>
+            </w:r>
+            <w:proofErr w:type="spellEnd"/>
+            <w:r>
+              <w:t>][_CURRENCY])</w:t>
+            </w:r>
+            <w:r>
+              <w:br/>
+            </w:r>
+            <w:proofErr w:type="spellStart"/>
+            <w:r>
+              <w:t>BlackJackAnte</w:t>
+            </w:r>
+            <w:proofErr w:type="spellEnd"/>
+            <w:r>
               <w:t>(</w:t>
             </w:r>
-            <w:proofErr w:type="gramEnd"/>
-            <w:r>
-              <w:t>)</w:t>
-            </w:r>
-          </w:p>
-        </w:tc>
-        <w:tc>
-          <w:tcPr>
-            <w:tcW w:w="1292" w:type="dxa"/>
-          </w:tcPr>
-          <w:p>
-            <w:r>
-              <w:t>Validation</w:t>
-            </w:r>
-          </w:p>
-        </w:tc>
-        <w:tc>
-          <w:tcPr>
-            <w:tcW w:w="2478" w:type="dxa"/>
-          </w:tcPr>
-          <w:p>
-            <w:r>
-              <w:t>print(players[</w:t>
-            </w:r>
             <w:proofErr w:type="spellStart"/>
             <w:r>
-              <w:t>i</w:t>
+              <w:t>players,dealersPot</w:t>
             </w:r>
             <w:proofErr w:type="spellEnd"/>
-            <w:r>
-              <w:t>][_CURRENCY])</w:t>
-            </w:r>
-            <w:r>
-              <w:br/>
-            </w:r>
-            <w:proofErr w:type="spellStart"/>
-            <w:r>
-              <w:t>BlackJackAnte</w:t>
-            </w:r>
-            <w:proofErr w:type="spellEnd"/>
-            <w:r>
-              <w:t>(</w:t>
-            </w:r>
-            <w:proofErr w:type="spellStart"/>
-            <w:proofErr w:type="gramStart"/>
-            <w:r>
-              <w:t>players,dealersPot</w:t>
-            </w:r>
-            <w:proofErr w:type="spellEnd"/>
-            <w:proofErr w:type="gramEnd"/>
             <w:r>
               <w:t>)</w:t>
             </w:r>
@@ -30845,17 +29473,12 @@
           </w:tcPr>
           <w:p>
             <w:proofErr w:type="spellStart"/>
-            <w:proofErr w:type="gramStart"/>
             <w:r>
               <w:t>BlackjackAnte</w:t>
             </w:r>
             <w:proofErr w:type="spellEnd"/>
             <w:r>
-              <w:t>(</w:t>
-            </w:r>
-            <w:proofErr w:type="gramEnd"/>
-            <w:r>
-              <w:t>)</w:t>
+              <w:t>()</w:t>
             </w:r>
           </w:p>
         </w:tc>
@@ -31315,6 +29938,762 @@
         <w:t>Review of how well your stage has gone</w:t>
       </w:r>
     </w:p>
+    <w:p/>
+    <w:p/>
+    <w:p/>
+    <w:p/>
+    <w:p/>
+    <w:p/>
+    <w:p/>
+    <w:p/>
+    <w:p/>
+    <w:p/>
+    <w:p/>
+    <w:p>
+      <w:pPr>
+        <w:pStyle w:val="Heading2"/>
+      </w:pPr>
+      <w:r>
+        <w:lastRenderedPageBreak/>
+        <w:t xml:space="preserve">Stage </w:t>
+      </w:r>
+      <w:r>
+        <w:t>3</w:t>
+      </w:r>
+      <w:r>
+        <w:t xml:space="preserve"> – </w:t>
+      </w:r>
+      <w:r>
+        <w:t>Currency System</w:t>
+      </w:r>
+    </w:p>
+    <w:p>
+      <w:pPr>
+        <w:pStyle w:val="Heading3"/>
+      </w:pPr>
+      <w:r>
+        <w:t>Design</w:t>
+      </w:r>
+    </w:p>
+    <w:p>
+      <w:pPr>
+        <w:rPr>
+          <w:highlight w:val="yellow"/>
+        </w:rPr>
+      </w:pPr>
+      <w:r>
+        <w:rPr>
+          <w:highlight w:val="yellow"/>
+        </w:rPr>
+        <w:t>Algorithms    - Should contain flowcharts / pseudocode</w:t>
+      </w:r>
+    </w:p>
+    <w:p/>
+    <w:p/>
+    <w:p/>
+    <w:p/>
+    <w:tbl>
+      <w:tblPr>
+        <w:tblStyle w:val="TableGrid"/>
+        <w:tblW w:w="0" w:type="auto"/>
+        <w:tblLook w:val="04A0" w:firstRow="1" w:lastRow="0" w:firstColumn="1" w:lastColumn="0" w:noHBand="0" w:noVBand="1"/>
+      </w:tblPr>
+      <w:tblGrid>
+        <w:gridCol w:w="5076"/>
+        <w:gridCol w:w="3940"/>
+      </w:tblGrid>
+      <w:tr>
+        <w:tc>
+          <w:tcPr>
+            <w:tcW w:w="4508" w:type="dxa"/>
+          </w:tcPr>
+          <w:p>
+            <w:proofErr w:type="spellStart"/>
+            <w:r>
+              <w:t>BlackjackWinningsCalulation</w:t>
+            </w:r>
+            <w:proofErr w:type="spellEnd"/>
+            <w:r>
+              <w:t>()</w:t>
+            </w:r>
+          </w:p>
+        </w:tc>
+        <w:tc>
+          <w:tcPr>
+            <w:tcW w:w="4508" w:type="dxa"/>
+          </w:tcPr>
+          <w:p/>
+        </w:tc>
+      </w:tr>
+      <w:tr>
+        <w:tc>
+          <w:tcPr>
+            <w:tcW w:w="4508" w:type="dxa"/>
+          </w:tcPr>
+          <w:p>
+            <w:r>
+              <w:drawing>
+                <wp:inline distT="0" distB="0" distL="0" distR="0" wp14:anchorId="37123F72" wp14:editId="7D1FA20C">
+                  <wp:extent cx="3079530" cy="3000375"/>
+                  <wp:effectExtent l="0" t="0" r="6985" b="0"/>
+                  <wp:docPr id="906416155" name="Picture 1" descr="A diagram of a graph&#10;&#10;AI-generated content may be incorrect."/>
+                  <wp:cNvGraphicFramePr>
+                    <a:graphicFrameLocks xmlns:a="http://schemas.openxmlformats.org/drawingml/2006/main" noChangeAspect="1"/>
+                  </wp:cNvGraphicFramePr>
+                  <a:graphic xmlns:a="http://schemas.openxmlformats.org/drawingml/2006/main">
+                    <a:graphicData uri="http://schemas.openxmlformats.org/drawingml/2006/picture">
+                      <pic:pic xmlns:pic="http://schemas.openxmlformats.org/drawingml/2006/picture">
+                        <pic:nvPicPr>
+                          <pic:cNvPr id="906416155" name="Picture 1" descr="A diagram of a graph&#10;&#10;AI-generated content may be incorrect."/>
+                          <pic:cNvPicPr/>
+                        </pic:nvPicPr>
+                        <pic:blipFill>
+                          <a:blip r:embed="rId91"/>
+                          <a:stretch>
+                            <a:fillRect/>
+                          </a:stretch>
+                        </pic:blipFill>
+                        <pic:spPr>
+                          <a:xfrm>
+                            <a:off x="0" y="0"/>
+                            <a:ext cx="3097219" cy="3017610"/>
+                          </a:xfrm>
+                          <a:prstGeom prst="rect">
+                            <a:avLst/>
+                          </a:prstGeom>
+                        </pic:spPr>
+                      </pic:pic>
+                    </a:graphicData>
+                  </a:graphic>
+                </wp:inline>
+              </w:drawing>
+            </w:r>
+          </w:p>
+        </w:tc>
+        <w:tc>
+          <w:tcPr>
+            <w:tcW w:w="4508" w:type="dxa"/>
+          </w:tcPr>
+          <w:p/>
+        </w:tc>
+      </w:tr>
+      <w:tr>
+        <w:tc>
+          <w:tcPr>
+            <w:tcW w:w="4508" w:type="dxa"/>
+          </w:tcPr>
+          <w:p/>
+        </w:tc>
+        <w:tc>
+          <w:tcPr>
+            <w:tcW w:w="4508" w:type="dxa"/>
+          </w:tcPr>
+          <w:p/>
+        </w:tc>
+      </w:tr>
+      <w:tr>
+        <w:tc>
+          <w:tcPr>
+            <w:tcW w:w="4508" w:type="dxa"/>
+          </w:tcPr>
+          <w:p/>
+        </w:tc>
+        <w:tc>
+          <w:tcPr>
+            <w:tcW w:w="4508" w:type="dxa"/>
+          </w:tcPr>
+          <w:p/>
+        </w:tc>
+      </w:tr>
+      <w:tr>
+        <w:tc>
+          <w:tcPr>
+            <w:tcW w:w="4508" w:type="dxa"/>
+          </w:tcPr>
+          <w:p/>
+        </w:tc>
+        <w:tc>
+          <w:tcPr>
+            <w:tcW w:w="4508" w:type="dxa"/>
+          </w:tcPr>
+          <w:p/>
+        </w:tc>
+      </w:tr>
+      <w:tr>
+        <w:tc>
+          <w:tcPr>
+            <w:tcW w:w="4508" w:type="dxa"/>
+          </w:tcPr>
+          <w:p/>
+        </w:tc>
+        <w:tc>
+          <w:tcPr>
+            <w:tcW w:w="4508" w:type="dxa"/>
+          </w:tcPr>
+          <w:p/>
+        </w:tc>
+      </w:tr>
+    </w:tbl>
+    <w:p/>
+    <w:p/>
+    <w:p/>
+    <w:p/>
+    <w:p/>
+    <w:p/>
+    <w:p/>
+    <w:p>
+      <w:pPr>
+        <w:pStyle w:val="Heading3"/>
+      </w:pPr>
+      <w:r>
+        <w:lastRenderedPageBreak/>
+        <w:t>Development</w:t>
+      </w:r>
+    </w:p>
+    <w:p>
+      <w:pPr>
+        <w:rPr>
+          <w:highlight w:val="yellow"/>
+        </w:rPr>
+      </w:pPr>
+      <w:r>
+        <w:rPr>
+          <w:highlight w:val="yellow"/>
+        </w:rPr>
+        <w:t>Show the code build over time</w:t>
+      </w:r>
+    </w:p>
+    <w:p>
+      <w:pPr>
+        <w:rPr>
+          <w:highlight w:val="yellow"/>
+        </w:rPr>
+      </w:pPr>
+      <w:r>
+        <w:rPr>
+          <w:highlight w:val="yellow"/>
+        </w:rPr>
+        <w:t>Justify your decisions</w:t>
+      </w:r>
+    </w:p>
+    <w:p>
+      <w:pPr>
+        <w:rPr>
+          <w:highlight w:val="yellow"/>
+        </w:rPr>
+      </w:pPr>
+      <w:r>
+        <w:rPr>
+          <w:highlight w:val="yellow"/>
+        </w:rPr>
+        <w:t>Screenshot errors and your fixes</w:t>
+      </w:r>
+    </w:p>
+    <w:p>
+      <w:pPr>
+        <w:rPr>
+          <w:highlight w:val="yellow"/>
+        </w:rPr>
+      </w:pPr>
+      <w:r>
+        <w:rPr>
+          <w:highlight w:val="yellow"/>
+        </w:rPr>
+        <w:t>Videos or screenshots of what it looks like when run</w:t>
+      </w:r>
+    </w:p>
+    <w:p>
+      <w:r>
+        <w:rPr>
+          <w:highlight w:val="yellow"/>
+        </w:rPr>
+        <w:t>Reference tutorials used</w:t>
+      </w:r>
+    </w:p>
+    <w:tbl>
+      <w:tblPr>
+        <w:tblStyle w:val="TableGrid"/>
+        <w:tblW w:w="0" w:type="auto"/>
+        <w:tblLook w:val="04A0" w:firstRow="1" w:lastRow="0" w:firstColumn="1" w:lastColumn="0" w:noHBand="0" w:noVBand="1"/>
+      </w:tblPr>
+      <w:tblGrid>
+        <w:gridCol w:w="4508"/>
+        <w:gridCol w:w="4508"/>
+      </w:tblGrid>
+      <w:tr>
+        <w:tc>
+          <w:tcPr>
+            <w:tcW w:w="4508" w:type="dxa"/>
+          </w:tcPr>
+          <w:p/>
+        </w:tc>
+        <w:tc>
+          <w:tcPr>
+            <w:tcW w:w="4508" w:type="dxa"/>
+          </w:tcPr>
+          <w:p/>
+        </w:tc>
+      </w:tr>
+      <w:tr>
+        <w:tc>
+          <w:tcPr>
+            <w:tcW w:w="4508" w:type="dxa"/>
+          </w:tcPr>
+          <w:p/>
+        </w:tc>
+        <w:tc>
+          <w:tcPr>
+            <w:tcW w:w="4508" w:type="dxa"/>
+          </w:tcPr>
+          <w:p/>
+        </w:tc>
+      </w:tr>
+      <w:tr>
+        <w:tc>
+          <w:tcPr>
+            <w:tcW w:w="4508" w:type="dxa"/>
+          </w:tcPr>
+          <w:p/>
+        </w:tc>
+        <w:tc>
+          <w:tcPr>
+            <w:tcW w:w="4508" w:type="dxa"/>
+          </w:tcPr>
+          <w:p/>
+        </w:tc>
+      </w:tr>
+      <w:tr>
+        <w:tc>
+          <w:tcPr>
+            <w:tcW w:w="4508" w:type="dxa"/>
+          </w:tcPr>
+          <w:p/>
+        </w:tc>
+        <w:tc>
+          <w:tcPr>
+            <w:tcW w:w="4508" w:type="dxa"/>
+          </w:tcPr>
+          <w:p/>
+        </w:tc>
+      </w:tr>
+      <w:tr>
+        <w:tc>
+          <w:tcPr>
+            <w:tcW w:w="4508" w:type="dxa"/>
+          </w:tcPr>
+          <w:p/>
+        </w:tc>
+        <w:tc>
+          <w:tcPr>
+            <w:tcW w:w="4508" w:type="dxa"/>
+          </w:tcPr>
+          <w:p/>
+        </w:tc>
+      </w:tr>
+      <w:tr>
+        <w:tc>
+          <w:tcPr>
+            <w:tcW w:w="4508" w:type="dxa"/>
+          </w:tcPr>
+          <w:p/>
+        </w:tc>
+        <w:tc>
+          <w:tcPr>
+            <w:tcW w:w="4508" w:type="dxa"/>
+          </w:tcPr>
+          <w:p/>
+        </w:tc>
+      </w:tr>
+    </w:tbl>
+    <w:p/>
+    <w:p/>
+    <w:p/>
+    <w:p/>
+    <w:p/>
+    <w:p/>
+    <w:p/>
+    <w:p/>
+    <w:p/>
+    <w:p/>
+    <w:p/>
+    <w:p/>
+    <w:p/>
+    <w:p/>
+    <w:p/>
+    <w:p/>
+    <w:p/>
+    <w:p/>
+    <w:p>
+      <w:pPr>
+        <w:pStyle w:val="Heading3"/>
+      </w:pPr>
+      <w:r>
+        <w:lastRenderedPageBreak/>
+        <w:t>Testing</w:t>
+      </w:r>
+    </w:p>
+    <w:p>
+      <w:pPr>
+        <w:rPr>
+          <w:highlight w:val="yellow"/>
+          <w:u w:val="single"/>
+        </w:rPr>
+      </w:pPr>
+      <w:r>
+        <w:rPr>
+          <w:highlight w:val="yellow"/>
+          <w:u w:val="single"/>
+        </w:rPr>
+        <w:t>Test table</w:t>
+      </w:r>
+      <w:r>
+        <w:rPr>
+          <w:highlight w:val="yellow"/>
+          <w:u w:val="single"/>
+        </w:rPr>
+        <w:t xml:space="preserve"> </w:t>
+      </w:r>
+    </w:p>
+    <w:tbl>
+      <w:tblPr>
+        <w:tblStyle w:val="TableGrid"/>
+        <w:tblW w:w="0" w:type="auto"/>
+        <w:tblLook w:val="04A0" w:firstRow="1" w:lastRow="0" w:firstColumn="1" w:lastColumn="0" w:noHBand="0" w:noVBand="1"/>
+      </w:tblPr>
+      <w:tblGrid>
+        <w:gridCol w:w="1288"/>
+        <w:gridCol w:w="1288"/>
+        <w:gridCol w:w="1288"/>
+        <w:gridCol w:w="1288"/>
+        <w:gridCol w:w="1288"/>
+        <w:gridCol w:w="1288"/>
+        <w:gridCol w:w="1288"/>
+      </w:tblGrid>
+      <w:tr>
+        <w:tc>
+          <w:tcPr>
+            <w:tcW w:w="1288" w:type="dxa"/>
+          </w:tcPr>
+          <w:p/>
+        </w:tc>
+        <w:tc>
+          <w:tcPr>
+            <w:tcW w:w="1288" w:type="dxa"/>
+          </w:tcPr>
+          <w:p/>
+        </w:tc>
+        <w:tc>
+          <w:tcPr>
+            <w:tcW w:w="1288" w:type="dxa"/>
+          </w:tcPr>
+          <w:p/>
+        </w:tc>
+        <w:tc>
+          <w:tcPr>
+            <w:tcW w:w="1288" w:type="dxa"/>
+          </w:tcPr>
+          <w:p/>
+        </w:tc>
+        <w:tc>
+          <w:tcPr>
+            <w:tcW w:w="1288" w:type="dxa"/>
+          </w:tcPr>
+          <w:p/>
+        </w:tc>
+        <w:tc>
+          <w:tcPr>
+            <w:tcW w:w="1288" w:type="dxa"/>
+          </w:tcPr>
+          <w:p/>
+        </w:tc>
+        <w:tc>
+          <w:tcPr>
+            <w:tcW w:w="1288" w:type="dxa"/>
+          </w:tcPr>
+          <w:p/>
+        </w:tc>
+      </w:tr>
+      <w:tr>
+        <w:tc>
+          <w:tcPr>
+            <w:tcW w:w="1288" w:type="dxa"/>
+          </w:tcPr>
+          <w:p/>
+        </w:tc>
+        <w:tc>
+          <w:tcPr>
+            <w:tcW w:w="1288" w:type="dxa"/>
+          </w:tcPr>
+          <w:p/>
+        </w:tc>
+        <w:tc>
+          <w:tcPr>
+            <w:tcW w:w="1288" w:type="dxa"/>
+          </w:tcPr>
+          <w:p/>
+        </w:tc>
+        <w:tc>
+          <w:tcPr>
+            <w:tcW w:w="1288" w:type="dxa"/>
+          </w:tcPr>
+          <w:p/>
+        </w:tc>
+        <w:tc>
+          <w:tcPr>
+            <w:tcW w:w="1288" w:type="dxa"/>
+          </w:tcPr>
+          <w:p/>
+        </w:tc>
+        <w:tc>
+          <w:tcPr>
+            <w:tcW w:w="1288" w:type="dxa"/>
+          </w:tcPr>
+          <w:p/>
+        </w:tc>
+        <w:tc>
+          <w:tcPr>
+            <w:tcW w:w="1288" w:type="dxa"/>
+          </w:tcPr>
+          <w:p/>
+        </w:tc>
+      </w:tr>
+      <w:tr>
+        <w:tc>
+          <w:tcPr>
+            <w:tcW w:w="1288" w:type="dxa"/>
+          </w:tcPr>
+          <w:p/>
+        </w:tc>
+        <w:tc>
+          <w:tcPr>
+            <w:tcW w:w="1288" w:type="dxa"/>
+          </w:tcPr>
+          <w:p/>
+        </w:tc>
+        <w:tc>
+          <w:tcPr>
+            <w:tcW w:w="1288" w:type="dxa"/>
+          </w:tcPr>
+          <w:p/>
+        </w:tc>
+        <w:tc>
+          <w:tcPr>
+            <w:tcW w:w="1288" w:type="dxa"/>
+          </w:tcPr>
+          <w:p/>
+        </w:tc>
+        <w:tc>
+          <w:tcPr>
+            <w:tcW w:w="1288" w:type="dxa"/>
+          </w:tcPr>
+          <w:p/>
+        </w:tc>
+        <w:tc>
+          <w:tcPr>
+            <w:tcW w:w="1288" w:type="dxa"/>
+          </w:tcPr>
+          <w:p/>
+        </w:tc>
+        <w:tc>
+          <w:tcPr>
+            <w:tcW w:w="1288" w:type="dxa"/>
+          </w:tcPr>
+          <w:p/>
+        </w:tc>
+      </w:tr>
+      <w:tr>
+        <w:tc>
+          <w:tcPr>
+            <w:tcW w:w="1288" w:type="dxa"/>
+          </w:tcPr>
+          <w:p/>
+        </w:tc>
+        <w:tc>
+          <w:tcPr>
+            <w:tcW w:w="1288" w:type="dxa"/>
+          </w:tcPr>
+          <w:p/>
+        </w:tc>
+        <w:tc>
+          <w:tcPr>
+            <w:tcW w:w="1288" w:type="dxa"/>
+          </w:tcPr>
+          <w:p/>
+        </w:tc>
+        <w:tc>
+          <w:tcPr>
+            <w:tcW w:w="1288" w:type="dxa"/>
+          </w:tcPr>
+          <w:p/>
+        </w:tc>
+        <w:tc>
+          <w:tcPr>
+            <w:tcW w:w="1288" w:type="dxa"/>
+          </w:tcPr>
+          <w:p/>
+        </w:tc>
+        <w:tc>
+          <w:tcPr>
+            <w:tcW w:w="1288" w:type="dxa"/>
+          </w:tcPr>
+          <w:p/>
+        </w:tc>
+        <w:tc>
+          <w:tcPr>
+            <w:tcW w:w="1288" w:type="dxa"/>
+          </w:tcPr>
+          <w:p/>
+        </w:tc>
+      </w:tr>
+      <w:tr>
+        <w:tc>
+          <w:tcPr>
+            <w:tcW w:w="1288" w:type="dxa"/>
+          </w:tcPr>
+          <w:p/>
+        </w:tc>
+        <w:tc>
+          <w:tcPr>
+            <w:tcW w:w="1288" w:type="dxa"/>
+          </w:tcPr>
+          <w:p/>
+        </w:tc>
+        <w:tc>
+          <w:tcPr>
+            <w:tcW w:w="1288" w:type="dxa"/>
+          </w:tcPr>
+          <w:p/>
+        </w:tc>
+        <w:tc>
+          <w:tcPr>
+            <w:tcW w:w="1288" w:type="dxa"/>
+          </w:tcPr>
+          <w:p/>
+        </w:tc>
+        <w:tc>
+          <w:tcPr>
+            <w:tcW w:w="1288" w:type="dxa"/>
+          </w:tcPr>
+          <w:p/>
+        </w:tc>
+        <w:tc>
+          <w:tcPr>
+            <w:tcW w:w="1288" w:type="dxa"/>
+          </w:tcPr>
+          <w:p/>
+        </w:tc>
+        <w:tc>
+          <w:tcPr>
+            <w:tcW w:w="1288" w:type="dxa"/>
+          </w:tcPr>
+          <w:p/>
+        </w:tc>
+      </w:tr>
+      <w:tr>
+        <w:tc>
+          <w:tcPr>
+            <w:tcW w:w="1288" w:type="dxa"/>
+          </w:tcPr>
+          <w:p/>
+        </w:tc>
+        <w:tc>
+          <w:tcPr>
+            <w:tcW w:w="1288" w:type="dxa"/>
+          </w:tcPr>
+          <w:p/>
+        </w:tc>
+        <w:tc>
+          <w:tcPr>
+            <w:tcW w:w="1288" w:type="dxa"/>
+          </w:tcPr>
+          <w:p/>
+        </w:tc>
+        <w:tc>
+          <w:tcPr>
+            <w:tcW w:w="1288" w:type="dxa"/>
+          </w:tcPr>
+          <w:p/>
+        </w:tc>
+        <w:tc>
+          <w:tcPr>
+            <w:tcW w:w="1288" w:type="dxa"/>
+          </w:tcPr>
+          <w:p/>
+        </w:tc>
+        <w:tc>
+          <w:tcPr>
+            <w:tcW w:w="1288" w:type="dxa"/>
+          </w:tcPr>
+          <w:p/>
+        </w:tc>
+        <w:tc>
+          <w:tcPr>
+            <w:tcW w:w="1288" w:type="dxa"/>
+          </w:tcPr>
+          <w:p/>
+        </w:tc>
+      </w:tr>
+    </w:tbl>
+    <w:p/>
+    <w:p>
+      <w:r>
+        <w:rPr>
+          <w:highlight w:val="yellow"/>
+          <w:u w:val="single"/>
+        </w:rPr>
+        <w:t>Evidence referenced</w:t>
+      </w:r>
+      <w:r>
+        <w:rPr>
+          <w:highlight w:val="yellow"/>
+        </w:rPr>
+        <w:t xml:space="preserve">   - screenshots or videos (with timestamps)</w:t>
+      </w:r>
+    </w:p>
+    <w:p>
+      <w:r>
+        <w:rPr>
+          <w:highlight w:val="yellow"/>
+        </w:rPr>
+        <w:t>Review of how well your stage has gone</w:t>
+      </w:r>
+    </w:p>
+    <w:p/>
+    <w:p/>
+    <w:p/>
+    <w:p/>
+    <w:p/>
+    <w:p/>
+    <w:p/>
+    <w:p/>
+    <w:p/>
+    <w:p/>
+    <w:p/>
+    <w:p/>
+    <w:p/>
+    <w:p/>
+    <w:p/>
+    <w:p/>
+    <w:p/>
+    <w:p/>
+    <w:p/>
+    <w:p/>
+    <w:p/>
+    <w:p/>
+    <w:p/>
+    <w:p/>
+    <w:p/>
+    <w:p/>
+    <w:p/>
+    <w:p/>
+    <w:p/>
+    <w:p/>
+    <w:p/>
+    <w:p/>
+    <w:p/>
+    <w:p/>
+    <w:p/>
+    <w:p/>
     <w:p/>
     <w:p/>
     <w:p/>
@@ -33534,6 +32913,7 @@
     <w:rsidRoot w:val="00FA72A6"/>
     <w:rsid w:val="000B0963"/>
     <w:rsid w:val="000D4081"/>
+    <w:rsid w:val="000F2988"/>
     <w:rsid w:val="00166C48"/>
     <w:rsid w:val="001802BA"/>
     <w:rsid w:val="001D61AC"/>
@@ -33582,6 +32962,7 @@
     <w:rsid w:val="00AB09B4"/>
     <w:rsid w:val="00AD47E5"/>
     <w:rsid w:val="00AE2BA7"/>
+    <w:rsid w:val="00B14114"/>
     <w:rsid w:val="00B86963"/>
     <w:rsid w:val="00BA7ABA"/>
     <w:rsid w:val="00BE226D"/>

</xml_diff>